<commit_message>
correccion de tamaño de panel superior y campanita de notificaciones
</commit_message>
<xml_diff>
--- a/docs/MANUAL_TECNICO.docx
+++ b/docs/MANUAL_TECNICO.docx
@@ -339,7 +339,7 @@
     <w:p>
       <w:pPr>
         <w:shd w:val="clear" w:color="auto" w:fill="F7F5F4"/>
-        <w:divId w:val="2095278104"/>
+        <w:divId w:val="104077737"/>
         <w:rPr>
           <w:rFonts w:ascii="Calibri" w:eastAsia="Times New Roman" w:hAnsi="Calibri" w:cs="Calibri"/>
           <w:color w:val="1F1A1A"/>
@@ -453,7 +453,7 @@
           <w:sz w:val="22"/>
           <w:szCs w:val="22"/>
         </w:rPr>
-        <w:pict w14:anchorId="6DE9046E">
+        <w:pict w14:anchorId="6BC256F3">
           <v:rect id="_x0000_i1025" style="width:0;height:1.5pt" o:hralign="center" o:hrstd="t" o:hr="t" fillcolor="#a0a0a0" stroked="f"/>
         </w:pict>
       </w:r>
@@ -839,7 +839,7 @@
           <w:sz w:val="22"/>
           <w:szCs w:val="22"/>
         </w:rPr>
-        <w:pict w14:anchorId="1F5BF4D0">
+        <w:pict w14:anchorId="198E94C7">
           <v:rect id="_x0000_i1026" style="width:0;height:1.5pt" o:hralign="center" o:hrstd="t" o:hr="t" fillcolor="#a0a0a0" stroked="f"/>
         </w:pict>
       </w:r>
@@ -1105,7 +1105,7 @@
           <w:sz w:val="22"/>
           <w:szCs w:val="22"/>
         </w:rPr>
-        <w:pict w14:anchorId="25CB84FD">
+        <w:pict w14:anchorId="0DEE4A5F">
           <v:rect id="_x0000_i1027" style="width:0;height:1.5pt" o:hralign="center" o:hrstd="t" o:hr="t" fillcolor="#a0a0a0" stroked="f"/>
         </w:pict>
       </w:r>
@@ -2196,7 +2196,7 @@
           <w:sz w:val="22"/>
           <w:szCs w:val="22"/>
         </w:rPr>
-        <w:pict w14:anchorId="0BB9A4F2">
+        <w:pict w14:anchorId="09A7DB35">
           <v:rect id="_x0000_i1028" style="width:0;height:1.5pt" o:hralign="center" o:hrstd="t" o:hr="t" fillcolor="#a0a0a0" stroked="f"/>
         </w:pict>
       </w:r>
@@ -2315,7 +2315,15 @@
           <w:color w:val="1F1A1A"/>
         </w:rPr>
         <w:br/>
-        <w:t>│   │   └── Escaneo.kt             ← Qué alerta toca al escanear (sin Firebase; tiene pruebas)</w:t>
+        <w:t>│   │   ├── Escaneo.kt             ← Qué alerta toca al escanear (sin Firebase; tiene pruebas)</w:t>
+      </w:r>
+      <w:r>
+        <w:rPr>
+          <w:rFonts w:cs="Calibri"/>
+          <w:color w:val="1F1A1A"/>
+        </w:rPr>
+        <w:br/>
+        <w:t>│   │   └── Avisos.kt              ← A quién se le avisa de qué y cómo se arma un aviso (sin Firebase; tiene pruebas)</w:t>
       </w:r>
       <w:r>
         <w:rPr>
@@ -2369,22 +2377,22 @@
           <w:color w:val="1F1A1A"/>
         </w:rPr>
         <w:br/>
-        <w:t>│       │   ├── PantallasComunes.kt← Calendario, Notificaciones, Horario, Perfil, Contraseña</w:t>
+        <w:t>│       │   ├── </w:t>
       </w:r>
       <w:r>
         <w:rPr>
           <w:rFonts w:cs="Calibri"/>
           <w:color w:val="1F1A1A"/>
         </w:rPr>
+        <w:t>PantallasComunes.kt← Calendario, Notificaciones, Horario, Perfil, Contraseña</w:t>
+      </w:r>
+      <w:r>
+        <w:rPr>
+          <w:rFonts w:cs="Calibri"/>
+          <w:color w:val="1F1A1A"/>
+        </w:rPr>
         <w:br/>
-        <w:t>│       │   ├── VariablesComunes.kt← Qué datos </w:t>
-      </w:r>
-      <w:r>
-        <w:rPr>
-          <w:rFonts w:cs="Calibri"/>
-          <w:color w:val="1F1A1A"/>
-        </w:rPr>
-        <w:t>necesitan las vistas comunes y de otros roles</w:t>
+        <w:t>│       │   ├── VariablesComunes.kt← Qué datos necesitan las vistas comunes y de otros roles</w:t>
       </w:r>
       <w:r>
         <w:rPr>
@@ -2432,22 +2440,22 @@
           <w:color w:val="1F1A1A"/>
         </w:rPr>
         <w:br/>
-        <w:t>│       │   ├── components/        ← AppIcon, PrimaryButton, SchoolLogo (Compose, de Bienvenida e Iniciar sesión)</w:t>
+        <w:t>│       │   ├── </w:t>
       </w:r>
       <w:r>
         <w:rPr>
           <w:rFonts w:cs="Calibri"/>
           <w:color w:val="1F1A1A"/>
         </w:rPr>
+        <w:t>components/        ← AppIcon, PrimaryButton, SchoolLogo (Compose, de Bienvenida e Iniciar sesión)</w:t>
+      </w:r>
+      <w:r>
+        <w:rPr>
+          <w:rFonts w:cs="Calibri"/>
+          <w:color w:val="1F1A1A"/>
+        </w:rPr>
         <w:br/>
-        <w:t>│       │   └── screens/           ←</w:t>
-      </w:r>
-      <w:r>
-        <w:rPr>
-          <w:rFonts w:cs="Calibri"/>
-          <w:color w:val="1F1A1A"/>
-        </w:rPr>
-        <w:t> BienvenidaScreen e IniciarSesionScreen (Compose)</w:t>
+        <w:t>│       │   └── screens/           ← BienvenidaScreen e IniciarSesionScreen (Compose)</w:t>
       </w:r>
       <w:r>
         <w:rPr>
@@ -2487,22 +2495,22 @@
           <w:color w:val="1F1A1A"/>
         </w:rPr>
         <w:br/>
-        <w:t>    ├── layout/                    ← LAS VISTAS XML: alumno_*, padre_*, prefecto_*, profesor_*, comun_*</w:t>
+        <w:t>    ├── layout/                    ← LAS VISTAS XML:</w:t>
       </w:r>
       <w:r>
         <w:rPr>
           <w:rFonts w:cs="Calibri"/>
           <w:color w:val="1F1A1A"/>
         </w:rPr>
+        <w:t> alumno_*, padre_*, prefecto_*, profesor_*, comun_*</w:t>
+      </w:r>
+      <w:r>
+        <w:rPr>
+          <w:rFonts w:cs="Calibri"/>
+          <w:color w:val="1F1A1A"/>
+        </w:rPr>
         <w:br/>
-        <w:t>    ├── values/                    ← colors_cetis, dimens_cetis, styles_cetis, </w:t>
-      </w:r>
-      <w:r>
-        <w:rPr>
-          <w:rFonts w:cs="Calibri"/>
-          <w:color w:val="1F1A1A"/>
-        </w:rPr>
-        <w:t>strings_*.xml</w:t>
+        <w:t>    ├── values/                    ← colors_cetis, dimens_cetis, styles_cetis, strings_*.xml</w:t>
       </w:r>
       <w:r>
         <w:rPr>
@@ -2709,16 +2717,7 @@
           <w:sz w:val="22"/>
           <w:szCs w:val="22"/>
         </w:rPr>
-        <w:t xml:space="preserve"> </w:t>
-      </w:r>
-      <w:r>
-        <w:rPr>
-          <w:rFonts w:ascii="Calibri" w:eastAsia="Times New Roman" w:hAnsi="Calibri" w:cs="Calibri"/>
-          <w:color w:val="1F1A1A"/>
-          <w:sz w:val="22"/>
-          <w:szCs w:val="22"/>
-        </w:rPr>
-        <w:t xml:space="preserve">con sus pantallas principales (las opciones del menú </w:t>
+        <w:t xml:space="preserve"> con sus pantallas principales (las opciones del menú </w:t>
       </w:r>
       <w:r>
         <w:rPr>
@@ -2876,7 +2875,16 @@
           <w:sz w:val="22"/>
           <w:szCs w:val="22"/>
         </w:rPr>
-        <w:t xml:space="preserve"> infla el XML, deja abajo el alto de la barra de gestos de Android y vuelve a llamar al bloque cada vez que cambian los datos.</w:t>
+        <w:t xml:space="preserve"> </w:t>
+      </w:r>
+      <w:r>
+        <w:rPr>
+          <w:rFonts w:ascii="Calibri" w:hAnsi="Calibri" w:cs="Calibri"/>
+          <w:color w:val="1F1A1A"/>
+          <w:sz w:val="22"/>
+          <w:szCs w:val="22"/>
+        </w:rPr>
+        <w:t>infla el XML, deja abajo el alto de la barra de gestos de Android y vuelve a llamar al bloque cada vez que cambian los datos.</w:t>
       </w:r>
     </w:p>
     <w:p>
@@ -4099,7 +4107,7 @@
           <w:sz w:val="22"/>
           <w:szCs w:val="22"/>
         </w:rPr>
-        <w:pict w14:anchorId="6BF992E1">
+        <w:pict w14:anchorId="079138AE">
           <v:rect id="_x0000_i1029" style="width:0;height:1.5pt" o:hralign="center" o:hrstd="t" o:hr="t" fillcolor="#a0a0a0" stroked="f"/>
         </w:pict>
       </w:r>
@@ -8392,7 +8400,7 @@
           <w:sz w:val="22"/>
           <w:szCs w:val="22"/>
         </w:rPr>
-        <w:pict w14:anchorId="6084C011">
+        <w:pict w14:anchorId="69381611">
           <v:rect id="_x0000_i1030" style="width:0;height:1.5pt" o:hralign="center" o:hrstd="t" o:hr="t" fillcolor="#a0a0a0" stroked="f"/>
         </w:pict>
       </w:r>
@@ -9013,7 +9021,16 @@
                 <w:sz w:val="19"/>
                 <w:szCs w:val="19"/>
               </w:rPr>
-              <w:t xml:space="preserve"> (+ partes) y </w:t>
+              <w:t xml:space="preserve"> </w:t>
+            </w:r>
+            <w:r>
+              <w:rPr>
+                <w:rFonts w:ascii="Calibri" w:hAnsi="Calibri" w:cs="Calibri"/>
+                <w:color w:val="1F1A1A"/>
+                <w:sz w:val="19"/>
+                <w:szCs w:val="19"/>
+              </w:rPr>
+              <w:t xml:space="preserve">(+ partes) y </w:t>
             </w:r>
             <w:r>
               <w:rPr>
@@ -11754,7 +11771,7 @@
           <w:sz w:val="22"/>
           <w:szCs w:val="22"/>
         </w:rPr>
-        <w:pict w14:anchorId="5FC92F9B">
+        <w:pict w14:anchorId="27B3867C">
           <v:rect id="_x0000_i1031" style="width:0;height:1.5pt" o:hralign="center" o:hrstd="t" o:hr="t" fillcolor="#a0a0a0" stroked="f"/>
         </w:pict>
       </w:r>
@@ -12683,7 +12700,7 @@
           <w:sz w:val="22"/>
           <w:szCs w:val="22"/>
         </w:rPr>
-        <w:pict w14:anchorId="44342892">
+        <w:pict w14:anchorId="2D3B03A3">
           <v:rect id="_x0000_i1032" style="width:0;height:1.5pt" o:hralign="center" o:hrstd="t" o:hr="t" fillcolor="#a0a0a0" stroked="f"/>
         </w:pict>
       </w:r>
@@ -12753,30 +12770,19 @@
           <w:sz w:val="22"/>
           <w:szCs w:val="22"/>
         </w:rPr>
+        <w:t xml:space="preserve"> → textos que nunca cambian.</w:t>
+      </w:r>
+      <w:r>
+        <w:rPr>
+          <w:rFonts w:ascii="Calibri" w:eastAsia="Times New Roman" w:hAnsi="Calibri" w:cs="Calibri"/>
+          <w:color w:val="1F1A1A"/>
+          <w:sz w:val="22"/>
+          <w:szCs w:val="22"/>
+        </w:rPr>
         <w:t xml:space="preserve"> </w:t>
       </w:r>
       <w:r>
         <w:rPr>
-          <w:rFonts w:ascii="Calibri" w:eastAsia="Times New Roman" w:hAnsi="Calibri" w:cs="Calibri"/>
-          <w:b/>
-          <w:bCs/>
-          <w:color w:val="1F1A1A"/>
-          <w:sz w:val="22"/>
-          <w:szCs w:val="22"/>
-        </w:rPr>
-        <w:t>→ textos que nunca cambian.</w:t>
-      </w:r>
-      <w:r>
-        <w:rPr>
-          <w:rFonts w:ascii="Calibri" w:eastAsia="Times New Roman" w:hAnsi="Calibri" w:cs="Calibri"/>
-          <w:color w:val="1F1A1A"/>
-          <w:sz w:val="22"/>
-          <w:szCs w:val="22"/>
-        </w:rPr>
-        <w:t xml:space="preserve"> </w:t>
-      </w:r>
-      <w:r>
-        <w:rPr>
           <w:rStyle w:val="HTMLCode"/>
         </w:rPr>
         <w:t>strings.xml</w:t>
@@ -12788,16 +12794,7 @@
           <w:sz w:val="22"/>
           <w:szCs w:val="22"/>
         </w:rPr>
-        <w:t xml:space="preserve"> </w:t>
-      </w:r>
-      <w:r>
-        <w:rPr>
-          <w:rFonts w:ascii="Calibri" w:eastAsia="Times New Roman" w:hAnsi="Calibri" w:cs="Calibri"/>
-          <w:color w:val="1F1A1A"/>
-          <w:sz w:val="22"/>
-          <w:szCs w:val="22"/>
-        </w:rPr>
-        <w:t xml:space="preserve">(generales y del padre), </w:t>
+        <w:t xml:space="preserve"> (generales y del padre), </w:t>
       </w:r>
       <w:r>
         <w:rPr>
@@ -12922,7 +12919,7 @@
           <w:sz w:val="22"/>
           <w:szCs w:val="22"/>
         </w:rPr>
-        <w:pict w14:anchorId="20054C06">
+        <w:pict w14:anchorId="4C074DB8">
           <v:rect id="_x0000_i1033" style="width:0;height:1.5pt" o:hralign="center" o:hrstd="t" o:hr="t" fillcolor="#a0a0a0" stroked="f"/>
         </w:pict>
       </w:r>
@@ -13764,28 +13761,13 @@
           <w:sz w:val="22"/>
           <w:szCs w:val="22"/>
         </w:rPr>
-        <w:t xml:space="preserve"> en la barra superior:</w:t>
-      </w:r>
-      <w:r>
-        <w:rPr>
-          <w:rFonts w:ascii="Calibri" w:eastAsia="Times New Roman" w:hAnsi="Calibri" w:cs="Calibri"/>
-          <w:color w:val="1F1A1A"/>
-          <w:sz w:val="22"/>
-          <w:szCs w:val="22"/>
-        </w:rPr>
-        <w:t xml:space="preserve"> </w:t>
+        <w:t xml:space="preserve"> en la barra superior: </w:t>
       </w:r>
       <w:r>
         <w:rPr>
           <w:rStyle w:val="HTMLCode"/>
         </w:rPr>
-        <w:t>&lt;</w:t>
-      </w:r>
-      <w:r>
-        <w:rPr>
-          <w:rStyle w:val="HTMLCode"/>
-        </w:rPr>
-        <w:t>ImageButton android:id="@+id/btn_menu" style="@style/Cetis.BarraSuperior.Menu" /&gt;</w:t>
+        <w:t>&lt;ImageButton android:id="@+id/btn_menu" style="@style/Cetis.BarraSuperior.Menu" /&gt;</w:t>
       </w:r>
       <w:r>
         <w:rPr>
@@ -13886,16 +13868,7 @@
           <w:sz w:val="22"/>
           <w:szCs w:val="22"/>
         </w:rPr>
-        <w:t>En Figma selecciona el ícono →</w:t>
-      </w:r>
-      <w:r>
-        <w:rPr>
-          <w:rFonts w:ascii="Calibri" w:eastAsia="Times New Roman" w:hAnsi="Calibri" w:cs="Calibri"/>
-          <w:color w:val="1F1A1A"/>
-          <w:sz w:val="22"/>
-          <w:szCs w:val="22"/>
-        </w:rPr>
-        <w:t xml:space="preserve"> </w:t>
+        <w:t xml:space="preserve">En Figma selecciona el ícono → </w:t>
       </w:r>
       <w:r>
         <w:rPr>
@@ -13915,25 +13888,7 @@
           <w:sz w:val="22"/>
           <w:szCs w:val="22"/>
         </w:rPr>
-        <w:t xml:space="preserve"> </w:t>
-      </w:r>
-      <w:r>
-        <w:rPr>
-          <w:rFonts w:ascii="Calibri" w:eastAsia="Times New Roman" w:hAnsi="Calibri" w:cs="Calibri"/>
-          <w:color w:val="1F1A1A"/>
-          <w:sz w:val="22"/>
-          <w:szCs w:val="22"/>
-        </w:rPr>
-        <w:t>→ formato</w:t>
-      </w:r>
-      <w:r>
-        <w:rPr>
-          <w:rFonts w:ascii="Calibri" w:eastAsia="Times New Roman" w:hAnsi="Calibri" w:cs="Calibri"/>
-          <w:color w:val="1F1A1A"/>
-          <w:sz w:val="22"/>
-          <w:szCs w:val="22"/>
-        </w:rPr>
-        <w:t xml:space="preserve"> </w:t>
+        <w:t xml:space="preserve"> → formato </w:t>
       </w:r>
       <w:r>
         <w:rPr>
@@ -13992,25 +13947,7 @@
           <w:sz w:val="22"/>
           <w:szCs w:val="22"/>
         </w:rPr>
-        <w:t xml:space="preserve"> </w:t>
-      </w:r>
-      <w:r>
-        <w:rPr>
-          <w:rFonts w:ascii="Calibri" w:eastAsia="Times New Roman" w:hAnsi="Calibri" w:cs="Calibri"/>
-          <w:color w:val="1F1A1A"/>
-          <w:sz w:val="22"/>
-          <w:szCs w:val="22"/>
-        </w:rPr>
-        <w:t>→</w:t>
-      </w:r>
-      <w:r>
-        <w:rPr>
-          <w:rFonts w:ascii="Calibri" w:eastAsia="Times New Roman" w:hAnsi="Calibri" w:cs="Calibri"/>
-          <w:color w:val="1F1A1A"/>
-          <w:sz w:val="22"/>
-          <w:szCs w:val="22"/>
-        </w:rPr>
-        <w:t xml:space="preserve"> </w:t>
+        <w:t xml:space="preserve"> → </w:t>
       </w:r>
       <w:r>
         <w:rPr>
@@ -14030,25 +13967,7 @@
           <w:sz w:val="22"/>
           <w:szCs w:val="22"/>
         </w:rPr>
-        <w:t xml:space="preserve"> </w:t>
-      </w:r>
-      <w:r>
-        <w:rPr>
-          <w:rFonts w:ascii="Calibri" w:eastAsia="Times New Roman" w:hAnsi="Calibri" w:cs="Calibri"/>
-          <w:color w:val="1F1A1A"/>
-          <w:sz w:val="22"/>
-          <w:szCs w:val="22"/>
-        </w:rPr>
-        <w:t>→</w:t>
-      </w:r>
-      <w:r>
-        <w:rPr>
-          <w:rFonts w:ascii="Calibri" w:eastAsia="Times New Roman" w:hAnsi="Calibri" w:cs="Calibri"/>
-          <w:color w:val="1F1A1A"/>
-          <w:sz w:val="22"/>
-          <w:szCs w:val="22"/>
-        </w:rPr>
-        <w:t xml:space="preserve"> </w:t>
+        <w:t xml:space="preserve"> → </w:t>
       </w:r>
       <w:r>
         <w:rPr>
@@ -14068,25 +13987,7 @@
           <w:sz w:val="22"/>
           <w:szCs w:val="22"/>
         </w:rPr>
-        <w:t xml:space="preserve"> </w:t>
-      </w:r>
-      <w:r>
-        <w:rPr>
-          <w:rFonts w:ascii="Calibri" w:eastAsia="Times New Roman" w:hAnsi="Calibri" w:cs="Calibri"/>
-          <w:color w:val="1F1A1A"/>
-          <w:sz w:val="22"/>
-          <w:szCs w:val="22"/>
-        </w:rPr>
-        <w:t>→</w:t>
-      </w:r>
-      <w:r>
-        <w:rPr>
-          <w:rFonts w:ascii="Calibri" w:eastAsia="Times New Roman" w:hAnsi="Calibri" w:cs="Calibri"/>
-          <w:color w:val="1F1A1A"/>
-          <w:sz w:val="22"/>
-          <w:szCs w:val="22"/>
-        </w:rPr>
-        <w:t xml:space="preserve"> </w:t>
+        <w:t xml:space="preserve"> → </w:t>
       </w:r>
       <w:r>
         <w:rPr>
@@ -14215,16 +14116,7 @@
           <w:sz w:val="22"/>
           <w:szCs w:val="22"/>
         </w:rPr>
-        <w:t xml:space="preserve"> </w:t>
-      </w:r>
-      <w:r>
-        <w:rPr>
-          <w:rFonts w:ascii="Calibri" w:hAnsi="Calibri" w:cs="Calibri"/>
-          <w:color w:val="1F1A1A"/>
-          <w:sz w:val="22"/>
-          <w:szCs w:val="22"/>
-        </w:rPr>
-        <w:t xml:space="preserve">es el inicio de sesión viejo (contraseñas guardadas en Firestore). </w:t>
+        <w:t xml:space="preserve"> es el inicio de sesión viejo (contraseñas guardadas en Firestore). </w:t>
       </w:r>
       <w:r>
         <w:rPr>
@@ -14263,7 +14155,7 @@
           <w:sz w:val="22"/>
           <w:szCs w:val="22"/>
         </w:rPr>
-        <w:pict w14:anchorId="064233A3">
+        <w:pict w14:anchorId="4F3D6CF3">
           <v:rect id="_x0000_i1034" style="width:0;height:1.5pt" o:hralign="center" o:hrstd="t" o:hr="t" fillcolor="#a0a0a0" stroked="f"/>
         </w:pict>
       </w:r>
@@ -14295,21 +14187,23 @@
           <w:rFonts w:cs="Calibri"/>
           <w:color w:val="1F1A1A"/>
         </w:rPr>
-        <w:t>CetisApp </w:t>
+        <w:t>CetisApp ──► CetisRepositorio.iniciarSesion(No. de control o usuario, contraseña)</w:t>
       </w:r>
       <w:r>
         <w:rPr>
           <w:rFonts w:cs="Calibri"/>
           <w:color w:val="1F1A1A"/>
         </w:rPr>
-        <w:t>──►</w:t>
+        <w:br/>
+        <w:t>   │             └─ Authentication + usuarios/{uid}</w:t>
       </w:r>
       <w:r>
         <w:rPr>
           <w:rFonts w:cs="Calibri"/>
           <w:color w:val="1F1A1A"/>
         </w:rPr>
-        <w:t> CetisRepositorio.iniciarSesion(No. de control o usuario, contraseña)</w:t>
+        <w:br/>
+        <w:t>   ├─ ¿debe cambiar su contraseña? ──► CambiarContrasenaXml ──► cambiarContrasena()</w:t>
       </w:r>
       <w:r>
         <w:rPr>
@@ -14317,35 +14211,38 @@
           <w:color w:val="1F1A1A"/>
         </w:rPr>
         <w:br/>
-        <w:t>   </w:t>
+        <w:t>   ├─ rol "alumno"   ──► AlumnoApp   ─┐</w:t>
       </w:r>
       <w:r>
         <w:rPr>
           <w:rFonts w:cs="Calibri"/>
           <w:color w:val="1F1A1A"/>
         </w:rPr>
-        <w:t>│</w:t>
+        <w:br/>
+        <w:t>   ├─ rol "padre"    ──► PadresApp   ─┤  piden </w:t>
       </w:r>
       <w:r>
         <w:rPr>
           <w:rFonts w:cs="Calibri"/>
           <w:color w:val="1F1A1A"/>
         </w:rPr>
-        <w:t>             </w:t>
+        <w:t>datos a CetisRepositorio</w:t>
       </w:r>
       <w:r>
         <w:rPr>
           <w:rFonts w:cs="Calibri"/>
           <w:color w:val="1F1A1A"/>
         </w:rPr>
-        <w:t>└─</w:t>
+        <w:br/>
+        <w:t>   ├─ rol "prefecto" ──► PrefectoApp ─┤  (alumno, horario, anuncios, eventos, grupos, estatus…)</w:t>
       </w:r>
       <w:r>
         <w:rPr>
           <w:rFonts w:cs="Calibri"/>
           <w:color w:val="1F1A1A"/>
         </w:rPr>
-        <w:t> Authentication + usuarios/{uid}</w:t>
+        <w:br/>
+        <w:t>   ├─ rol "profesor" ──► ProfesorApp ─┘  y el *Vistas.kt del rol los pone en el XML</w:t>
       </w:r>
       <w:r>
         <w:rPr>
@@ -14353,285 +14250,7 @@
           <w:color w:val="1F1A1A"/>
         </w:rPr>
         <w:br/>
-        <w:t>   </w:t>
-      </w:r>
-      <w:r>
-        <w:rPr>
-          <w:rFonts w:cs="Calibri"/>
-          <w:color w:val="1F1A1A"/>
-        </w:rPr>
-        <w:t>├─</w:t>
-      </w:r>
-      <w:r>
-        <w:rPr>
-          <w:rFonts w:cs="Calibri"/>
-          <w:color w:val="1F1A1A"/>
-        </w:rPr>
-        <w:t> ¿debe cambiar su contraseña? </w:t>
-      </w:r>
-      <w:r>
-        <w:rPr>
-          <w:rFonts w:cs="Calibri"/>
-          <w:color w:val="1F1A1A"/>
-        </w:rPr>
-        <w:t>──►</w:t>
-      </w:r>
-      <w:r>
-        <w:rPr>
-          <w:rFonts w:cs="Calibri"/>
-          <w:color w:val="1F1A1A"/>
-        </w:rPr>
-        <w:t> CambiarContrasenaXml </w:t>
-      </w:r>
-      <w:r>
-        <w:rPr>
-          <w:rFonts w:cs="Calibri"/>
-          <w:color w:val="1F1A1A"/>
-        </w:rPr>
-        <w:t>──►</w:t>
-      </w:r>
-      <w:r>
-        <w:rPr>
-          <w:rFonts w:cs="Calibri"/>
-          <w:color w:val="1F1A1A"/>
-        </w:rPr>
-        <w:t> cambiarContrasena()</w:t>
-      </w:r>
-      <w:r>
-        <w:rPr>
-          <w:rFonts w:cs="Calibri"/>
-          <w:color w:val="1F1A1A"/>
-        </w:rPr>
-        <w:br/>
-        <w:t>   </w:t>
-      </w:r>
-      <w:r>
-        <w:rPr>
-          <w:rFonts w:cs="Calibri"/>
-          <w:color w:val="1F1A1A"/>
-        </w:rPr>
-        <w:t>├─</w:t>
-      </w:r>
-      <w:r>
-        <w:rPr>
-          <w:rFonts w:cs="Calibri"/>
-          <w:color w:val="1F1A1A"/>
-        </w:rPr>
-        <w:t> rol "alumno"   </w:t>
-      </w:r>
-      <w:r>
-        <w:rPr>
-          <w:rFonts w:cs="Calibri"/>
-          <w:color w:val="1F1A1A"/>
-        </w:rPr>
-        <w:t>──►</w:t>
-      </w:r>
-      <w:r>
-        <w:rPr>
-          <w:rFonts w:cs="Calibri"/>
-          <w:color w:val="1F1A1A"/>
-        </w:rPr>
-        <w:t> AlumnoApp   </w:t>
-      </w:r>
-      <w:r>
-        <w:rPr>
-          <w:rFonts w:cs="Calibri"/>
-          <w:color w:val="1F1A1A"/>
-        </w:rPr>
-        <w:t>─┐</w:t>
-      </w:r>
-      <w:r>
-        <w:rPr>
-          <w:rFonts w:cs="Calibri"/>
-          <w:color w:val="1F1A1A"/>
-        </w:rPr>
-        <w:br/>
-        <w:t>   </w:t>
-      </w:r>
-      <w:r>
-        <w:rPr>
-          <w:rFonts w:cs="Calibri"/>
-          <w:color w:val="1F1A1A"/>
-        </w:rPr>
-        <w:t>├─</w:t>
-      </w:r>
-      <w:r>
-        <w:rPr>
-          <w:rFonts w:cs="Calibri"/>
-          <w:color w:val="1F1A1A"/>
-        </w:rPr>
-        <w:t> rol "padre"    </w:t>
-      </w:r>
-      <w:r>
-        <w:rPr>
-          <w:rFonts w:cs="Calibri"/>
-          <w:color w:val="1F1A1A"/>
-        </w:rPr>
-        <w:t>──►</w:t>
-      </w:r>
-      <w:r>
-        <w:rPr>
-          <w:rFonts w:cs="Calibri"/>
-          <w:color w:val="1F1A1A"/>
-        </w:rPr>
-        <w:t> PadresApp   </w:t>
-      </w:r>
-      <w:r>
-        <w:rPr>
-          <w:rFonts w:cs="Calibri"/>
-          <w:color w:val="1F1A1A"/>
-        </w:rPr>
-        <w:t>─┤</w:t>
-      </w:r>
-      <w:r>
-        <w:rPr>
-          <w:rFonts w:cs="Calibri"/>
-          <w:color w:val="1F1A1A"/>
-        </w:rPr>
-        <w:t>  piden datos a </w:t>
-      </w:r>
-      <w:r>
-        <w:rPr>
-          <w:rFonts w:cs="Calibri"/>
-          <w:color w:val="1F1A1A"/>
-        </w:rPr>
-        <w:t>CetisRepositorio</w:t>
-      </w:r>
-      <w:r>
-        <w:rPr>
-          <w:rFonts w:cs="Calibri"/>
-          <w:color w:val="1F1A1A"/>
-        </w:rPr>
-        <w:br/>
-        <w:t>   </w:t>
-      </w:r>
-      <w:r>
-        <w:rPr>
-          <w:rFonts w:cs="Calibri"/>
-          <w:color w:val="1F1A1A"/>
-        </w:rPr>
-        <w:t>├─</w:t>
-      </w:r>
-      <w:r>
-        <w:rPr>
-          <w:rFonts w:cs="Calibri"/>
-          <w:color w:val="1F1A1A"/>
-        </w:rPr>
-        <w:t> rol "prefecto" </w:t>
-      </w:r>
-      <w:r>
-        <w:rPr>
-          <w:rFonts w:cs="Calibri"/>
-          <w:color w:val="1F1A1A"/>
-        </w:rPr>
-        <w:t>──►</w:t>
-      </w:r>
-      <w:r>
-        <w:rPr>
-          <w:rFonts w:cs="Calibri"/>
-          <w:color w:val="1F1A1A"/>
-        </w:rPr>
-        <w:t> PrefectoApp </w:t>
-      </w:r>
-      <w:r>
-        <w:rPr>
-          <w:rFonts w:cs="Calibri"/>
-          <w:color w:val="1F1A1A"/>
-        </w:rPr>
-        <w:t>─┤</w:t>
-      </w:r>
-      <w:r>
-        <w:rPr>
-          <w:rFonts w:cs="Calibri"/>
-          <w:color w:val="1F1A1A"/>
-        </w:rPr>
-        <w:t>  (alumno, horario, anuncios, eventos, grupos, estatus…)</w:t>
-      </w:r>
-      <w:r>
-        <w:rPr>
-          <w:rFonts w:cs="Calibri"/>
-          <w:color w:val="1F1A1A"/>
-        </w:rPr>
-        <w:br/>
-        <w:t>   </w:t>
-      </w:r>
-      <w:r>
-        <w:rPr>
-          <w:rFonts w:cs="Calibri"/>
-          <w:color w:val="1F1A1A"/>
-        </w:rPr>
-        <w:t>├─</w:t>
-      </w:r>
-      <w:r>
-        <w:rPr>
-          <w:rFonts w:cs="Calibri"/>
-          <w:color w:val="1F1A1A"/>
-        </w:rPr>
-        <w:t> rol "profesor" </w:t>
-      </w:r>
-      <w:r>
-        <w:rPr>
-          <w:rFonts w:cs="Calibri"/>
-          <w:color w:val="1F1A1A"/>
-        </w:rPr>
-        <w:t>──►</w:t>
-      </w:r>
-      <w:r>
-        <w:rPr>
-          <w:rFonts w:cs="Calibri"/>
-          <w:color w:val="1F1A1A"/>
-        </w:rPr>
-        <w:t> ProfesorApp </w:t>
-      </w:r>
-      <w:r>
-        <w:rPr>
-          <w:rFonts w:cs="Calibri"/>
-          <w:color w:val="1F1A1A"/>
-        </w:rPr>
-        <w:t>─┘</w:t>
-      </w:r>
-      <w:r>
-        <w:rPr>
-          <w:rFonts w:cs="Calibri"/>
-          <w:color w:val="1F1A1A"/>
-        </w:rPr>
-        <w:t>  y el *Vistas.kt del rol los pone en el XML</w:t>
-      </w:r>
-      <w:r>
-        <w:rPr>
-          <w:rFonts w:cs="Calibri"/>
-          <w:color w:val="1F1A1A"/>
-        </w:rPr>
-        <w:br/>
-        <w:t>   </w:t>
-      </w:r>
-      <w:r>
-        <w:rPr>
-          <w:rFonts w:cs="Calibri"/>
-          <w:color w:val="1F1A1A"/>
-        </w:rPr>
-        <w:t>└─</w:t>
-      </w:r>
-      <w:r>
-        <w:rPr>
-          <w:rFonts w:cs="Calibri"/>
-          <w:color w:val="1F1A1A"/>
-        </w:rPr>
-        <w:t> otro rol       </w:t>
-      </w:r>
-      <w:r>
-        <w:rPr>
-          <w:rFonts w:cs="Calibri"/>
-          <w:color w:val="1F1A1A"/>
-        </w:rPr>
-        <w:t>──►</w:t>
-      </w:r>
-      <w:r>
-        <w:rPr>
-          <w:rFonts w:cs="Calibri"/>
-          <w:color w:val="1F1A1A"/>
-        </w:rPr>
-        <w:t> aviso "se usa desde la web" + Cerrar sesión</w:t>
+        <w:t>   └─ otro rol       ──► aviso "se usa desde la web" + Cerrar sesión</w:t>
       </w:r>
     </w:p>
     <w:p>
@@ -15015,37 +14634,147 @@
           <w:sz w:val="22"/>
           <w:szCs w:val="22"/>
         </w:rPr>
-        <w:t>Pruebas sin teléfono:</w:t>
-      </w:r>
-      <w:r>
-        <w:rPr>
-          <w:rFonts w:ascii="Calibri" w:eastAsia="Times New Roman" w:hAnsi="Calibri" w:cs="Calibri"/>
-          <w:color w:val="1F1A1A"/>
-          <w:sz w:val="22"/>
-          <w:szCs w:val="22"/>
-        </w:rPr>
-        <w:t xml:space="preserve"> </w:t>
+        <w:t>Avisos (notificaciones dentro de la app, ADR-010):</w:t>
+      </w:r>
+      <w:r>
+        <w:rPr>
+          <w:rFonts w:ascii="Calibri" w:eastAsia="Times New Roman" w:hAnsi="Calibri" w:cs="Calibri"/>
+          <w:color w:val="1F1A1A"/>
+          <w:sz w:val="22"/>
+          <w:szCs w:val="22"/>
+        </w:rPr>
+        <w:t xml:space="preserve"> todos van al buzón de cada cuenta, </w:t>
       </w:r>
       <w:r>
         <w:rPr>
           <w:rStyle w:val="HTMLCode"/>
         </w:rPr>
-        <w:t>app/src/test/.../EscaneoTest.kt</w:t>
-      </w:r>
-      <w:r>
-        <w:rPr>
-          <w:rFonts w:ascii="Calibri" w:eastAsia="Times New Roman" w:hAnsi="Calibri" w:cs="Calibri"/>
-          <w:color w:val="1F1A1A"/>
-          <w:sz w:val="22"/>
-          <w:szCs w:val="22"/>
-        </w:rPr>
-        <w:t xml:space="preserve"> revisa las reglas de las alertas y del No. de control. Se corren con </w:t>
+        <w:t>usuarios/{uid}/notificaciones</w:t>
+      </w:r>
+      <w:r>
+        <w:rPr>
+          <w:rFonts w:ascii="Calibri" w:eastAsia="Times New Roman" w:hAnsi="Calibri" w:cs="Calibri"/>
+          <w:color w:val="1F1A1A"/>
+          <w:sz w:val="22"/>
+          <w:szCs w:val="22"/>
+        </w:rPr>
+        <w:t xml:space="preserve">. </w:t>
       </w:r>
       <w:r>
         <w:rPr>
           <w:rStyle w:val="HTMLCode"/>
         </w:rPr>
-        <w:t>./gradlew.bat :app:testDebugUnitTest</w:t>
+        <w:t>Avisos.kt</w:t>
+      </w:r>
+      <w:r>
+        <w:rPr>
+          <w:rFonts w:ascii="Calibri" w:eastAsia="Times New Roman" w:hAnsi="Calibri" w:cs="Calibri"/>
+          <w:color w:val="1F1A1A"/>
+          <w:sz w:val="22"/>
+          <w:szCs w:val="22"/>
+        </w:rPr>
+        <w:t xml:space="preserve"> decide a quién (padres del alumno, según </w:t>
+      </w:r>
+      <w:r>
+        <w:rPr>
+          <w:rStyle w:val="HTMLCode"/>
+        </w:rPr>
+        <w:t>configuracion/plantel</w:t>
+      </w:r>
+      <w:r>
+        <w:rPr>
+          <w:rFonts w:ascii="Calibri" w:eastAsia="Times New Roman" w:hAnsi="Calibri" w:cs="Calibri"/>
+          <w:color w:val="1F1A1A"/>
+          <w:sz w:val="22"/>
+          <w:szCs w:val="22"/>
+        </w:rPr>
+        <w:t xml:space="preserve">) y arma el documento con </w:t>
+      </w:r>
+      <w:r>
+        <w:rPr>
+          <w:rStyle w:val="HTMLCode"/>
+        </w:rPr>
+        <w:t>Avisos.nuevo(...)</w:t>
+      </w:r>
+      <w:r>
+        <w:rPr>
+          <w:rFonts w:ascii="Calibri" w:eastAsia="Times New Roman" w:hAnsi="Calibri" w:cs="Calibri"/>
+          <w:color w:val="1F1A1A"/>
+          <w:sz w:val="22"/>
+          <w:szCs w:val="22"/>
+        </w:rPr>
+        <w:t xml:space="preserve">; quien guarda (el escaneo o el estatus del profesor) lo mete </w:t>
+      </w:r>
+      <w:r>
+        <w:rPr>
+          <w:rFonts w:ascii="Calibri" w:eastAsia="Times New Roman" w:hAnsi="Calibri" w:cs="Calibri"/>
+          <w:b/>
+          <w:bCs/>
+          <w:color w:val="1F1A1A"/>
+          <w:sz w:val="22"/>
+          <w:szCs w:val="22"/>
+        </w:rPr>
+        <w:t>en el mismo lote</w:t>
+      </w:r>
+      <w:r>
+        <w:rPr>
+          <w:rFonts w:ascii="Calibri" w:eastAsia="Times New Roman" w:hAnsi="Calibri" w:cs="Calibri"/>
+          <w:color w:val="1F1A1A"/>
+          <w:sz w:val="22"/>
+          <w:szCs w:val="22"/>
+        </w:rPr>
+        <w:t xml:space="preserve"> que lo demás, para que se guarde todo o nada. La campana se enciende con </w:t>
+      </w:r>
+      <w:r>
+        <w:rPr>
+          <w:rStyle w:val="HTMLCode"/>
+        </w:rPr>
+        <w:t>sinLeerEnVivo(uid)</w:t>
+      </w:r>
+      <w:r>
+        <w:rPr>
+          <w:rFonts w:ascii="Calibri" w:eastAsia="Times New Roman" w:hAnsi="Calibri" w:cs="Calibri"/>
+          <w:color w:val="1F1A1A"/>
+          <w:sz w:val="22"/>
+          <w:szCs w:val="22"/>
+        </w:rPr>
+        <w:t xml:space="preserve"> (</w:t>
+      </w:r>
+      <w:r>
+        <w:rPr>
+          <w:rStyle w:val="HTMLCode"/>
+        </w:rPr>
+        <w:t>ui/comun/Carga.kt</w:t>
+      </w:r>
+      <w:r>
+        <w:rPr>
+          <w:rFonts w:ascii="Calibri" w:eastAsia="Times New Roman" w:hAnsi="Calibri" w:cs="Calibri"/>
+          <w:color w:val="1F1A1A"/>
+          <w:sz w:val="22"/>
+          <w:szCs w:val="22"/>
+        </w:rPr>
+        <w:t xml:space="preserve">) y </w:t>
+      </w:r>
+      <w:r>
+        <w:rPr>
+          <w:rStyle w:val="HTMLCode"/>
+        </w:rPr>
+        <w:t>VistasComunes.marcarCampana</w:t>
+      </w:r>
+      <w:r>
+        <w:rPr>
+          <w:rFonts w:ascii="Calibri" w:eastAsia="Times New Roman" w:hAnsi="Calibri" w:cs="Calibri"/>
+          <w:color w:val="1F1A1A"/>
+          <w:sz w:val="22"/>
+          <w:szCs w:val="22"/>
+        </w:rPr>
+        <w:t xml:space="preserve">; la lista se escucha con </w:t>
+      </w:r>
+      <w:r>
+        <w:rPr>
+          <w:rStyle w:val="HTMLCode"/>
+        </w:rPr>
+        <w:t>CetisRepositorio.escucharNotificaciones</w:t>
       </w:r>
       <w:r>
         <w:rPr>
@@ -15059,21 +14788,271 @@
     </w:p>
     <w:p>
       <w:pPr>
-        <w:rPr>
-          <w:rFonts w:ascii="Calibri" w:eastAsia="Times New Roman" w:hAnsi="Calibri" w:cs="Calibri"/>
-          <w:color w:val="1F1A1A"/>
-          <w:sz w:val="22"/>
-          <w:szCs w:val="22"/>
-        </w:rPr>
-      </w:pPr>
-      <w:r>
-        <w:rPr>
-          <w:rFonts w:ascii="Calibri" w:eastAsia="Times New Roman" w:hAnsi="Calibri" w:cs="Calibri"/>
-          <w:color w:val="1F1A1A"/>
-          <w:sz w:val="22"/>
-          <w:szCs w:val="22"/>
-        </w:rPr>
-        <w:pict w14:anchorId="34C3A332">
+        <w:numPr>
+          <w:ilvl w:val="0"/>
+          <w:numId w:val="9"/>
+        </w:numPr>
+        <w:spacing w:after="120"/>
+        <w:rPr>
+          <w:rFonts w:ascii="Calibri" w:eastAsia="Times New Roman" w:hAnsi="Calibri" w:cs="Calibri"/>
+          <w:color w:val="1F1A1A"/>
+          <w:sz w:val="22"/>
+          <w:szCs w:val="22"/>
+        </w:rPr>
+      </w:pPr>
+      <w:r>
+        <w:rPr>
+          <w:rFonts w:ascii="Calibri" w:eastAsia="Times New Roman" w:hAnsi="Calibri" w:cs="Calibri"/>
+          <w:b/>
+          <w:bCs/>
+          <w:color w:val="1F1A1A"/>
+          <w:sz w:val="22"/>
+          <w:szCs w:val="22"/>
+        </w:rPr>
+        <w:t>Para agregar un aviso nuevo:</w:t>
+      </w:r>
+      <w:r>
+        <w:rPr>
+          <w:rFonts w:ascii="Calibri" w:eastAsia="Times New Roman" w:hAnsi="Calibri" w:cs="Calibri"/>
+          <w:color w:val="1F1A1A"/>
+          <w:sz w:val="22"/>
+          <w:szCs w:val="22"/>
+        </w:rPr>
+        <w:t xml:space="preserve"> 1) si es un tipo nuevo, agrégalo a </w:t>
+      </w:r>
+      <w:r>
+        <w:rPr>
+          <w:rStyle w:val="HTMLCode"/>
+        </w:rPr>
+        <w:t>TipoAviso</w:t>
+      </w:r>
+      <w:r>
+        <w:rPr>
+          <w:rFonts w:ascii="Calibri" w:eastAsia="Times New Roman" w:hAnsi="Calibri" w:cs="Calibri"/>
+          <w:color w:val="1F1A1A"/>
+          <w:sz w:val="22"/>
+          <w:szCs w:val="22"/>
+        </w:rPr>
+        <w:t xml:space="preserve"> (</w:t>
+      </w:r>
+      <w:r>
+        <w:rPr>
+          <w:rStyle w:val="HTMLCode"/>
+        </w:rPr>
+        <w:t>Modelos.kt</w:t>
+      </w:r>
+      <w:r>
+        <w:rPr>
+          <w:rFonts w:ascii="Calibri" w:eastAsia="Times New Roman" w:hAnsi="Calibri" w:cs="Calibri"/>
+          <w:color w:val="1F1A1A"/>
+          <w:sz w:val="22"/>
+          <w:szCs w:val="22"/>
+        </w:rPr>
+        <w:t xml:space="preserve">), a la lista de </w:t>
+      </w:r>
+      <w:r>
+        <w:rPr>
+          <w:rStyle w:val="HTMLCode"/>
+        </w:rPr>
+        <w:t>avisoValido</w:t>
+      </w:r>
+      <w:r>
+        <w:rPr>
+          <w:rFonts w:ascii="Calibri" w:eastAsia="Times New Roman" w:hAnsi="Calibri" w:cs="Calibri"/>
+          <w:color w:val="1F1A1A"/>
+          <w:sz w:val="22"/>
+          <w:szCs w:val="22"/>
+        </w:rPr>
+        <w:t xml:space="preserve"> en </w:t>
+      </w:r>
+      <w:r>
+        <w:rPr>
+          <w:rStyle w:val="HTMLCode"/>
+        </w:rPr>
+        <w:t>firebase/firestore.rules</w:t>
+      </w:r>
+      <w:r>
+        <w:rPr>
+          <w:rFonts w:ascii="Calibri" w:eastAsia="Times New Roman" w:hAnsi="Calibri" w:cs="Calibri"/>
+          <w:color w:val="1F1A1A"/>
+          <w:sz w:val="22"/>
+          <w:szCs w:val="22"/>
+        </w:rPr>
+        <w:t xml:space="preserve"> y a su prueba en </w:t>
+      </w:r>
+      <w:r>
+        <w:rPr>
+          <w:rStyle w:val="HTMLCode"/>
+        </w:rPr>
+        <w:t>firebase/pruebas-reglas</w:t>
+      </w:r>
+      <w:r>
+        <w:rPr>
+          <w:rFonts w:ascii="Calibri" w:eastAsia="Times New Roman" w:hAnsi="Calibri" w:cs="Calibri"/>
+          <w:color w:val="1F1A1A"/>
+          <w:sz w:val="22"/>
+          <w:szCs w:val="22"/>
+        </w:rPr>
+        <w:t xml:space="preserve">; 2) arma el aviso con </w:t>
+      </w:r>
+      <w:r>
+        <w:rPr>
+          <w:rStyle w:val="HTMLCode"/>
+        </w:rPr>
+        <w:t>Avisos.nuevo(...)</w:t>
+      </w:r>
+      <w:r>
+        <w:rPr>
+          <w:rFonts w:ascii="Calibri" w:eastAsia="Times New Roman" w:hAnsi="Calibri" w:cs="Calibri"/>
+          <w:color w:val="1F1A1A"/>
+          <w:sz w:val="22"/>
+          <w:szCs w:val="22"/>
+        </w:rPr>
+        <w:t xml:space="preserve"> (texto en </w:t>
+      </w:r>
+      <w:r>
+        <w:rPr>
+          <w:rStyle w:val="HTMLCode"/>
+        </w:rPr>
+        <w:t>strings_*.xml</w:t>
+      </w:r>
+      <w:r>
+        <w:rPr>
+          <w:rFonts w:ascii="Calibri" w:eastAsia="Times New Roman" w:hAnsi="Calibri" w:cs="Calibri"/>
+          <w:color w:val="1F1A1A"/>
+          <w:sz w:val="22"/>
+          <w:szCs w:val="22"/>
+        </w:rPr>
+        <w:t xml:space="preserve">); 3) guárdalo en el mismo lote que la acción, en </w:t>
+      </w:r>
+      <w:r>
+        <w:rPr>
+          <w:rStyle w:val="HTMLCode"/>
+        </w:rPr>
+        <w:t>CetisRepositorio</w:t>
+      </w:r>
+      <w:r>
+        <w:rPr>
+          <w:rFonts w:ascii="Calibri" w:eastAsia="Times New Roman" w:hAnsi="Calibri" w:cs="Calibri"/>
+          <w:color w:val="1F1A1A"/>
+          <w:sz w:val="22"/>
+          <w:szCs w:val="22"/>
+        </w:rPr>
+        <w:t>.</w:t>
+      </w:r>
+    </w:p>
+    <w:p>
+      <w:pPr>
+        <w:numPr>
+          <w:ilvl w:val="0"/>
+          <w:numId w:val="9"/>
+        </w:numPr>
+        <w:spacing w:after="120"/>
+        <w:rPr>
+          <w:rFonts w:ascii="Calibri" w:eastAsia="Times New Roman" w:hAnsi="Calibri" w:cs="Calibri"/>
+          <w:color w:val="1F1A1A"/>
+          <w:sz w:val="22"/>
+          <w:szCs w:val="22"/>
+        </w:rPr>
+      </w:pPr>
+      <w:r>
+        <w:rPr>
+          <w:rFonts w:ascii="Calibri" w:eastAsia="Times New Roman" w:hAnsi="Calibri" w:cs="Calibri"/>
+          <w:b/>
+          <w:bCs/>
+          <w:color w:val="1F1A1A"/>
+          <w:sz w:val="22"/>
+          <w:szCs w:val="22"/>
+        </w:rPr>
+        <w:t>Pruebas sin teléfono:</w:t>
+      </w:r>
+      <w:r>
+        <w:rPr>
+          <w:rFonts w:ascii="Calibri" w:eastAsia="Times New Roman" w:hAnsi="Calibri" w:cs="Calibri"/>
+          <w:color w:val="1F1A1A"/>
+          <w:sz w:val="22"/>
+          <w:szCs w:val="22"/>
+        </w:rPr>
+        <w:t xml:space="preserve"> </w:t>
+      </w:r>
+      <w:r>
+        <w:rPr>
+          <w:rStyle w:val="HTMLCode"/>
+        </w:rPr>
+        <w:t>app/src/test/.../EscaneoTest.kt</w:t>
+      </w:r>
+      <w:r>
+        <w:rPr>
+          <w:rFonts w:ascii="Calibri" w:eastAsia="Times New Roman" w:hAnsi="Calibri" w:cs="Calibri"/>
+          <w:color w:val="1F1A1A"/>
+          <w:sz w:val="22"/>
+          <w:szCs w:val="22"/>
+        </w:rPr>
+        <w:t xml:space="preserve"> revisa las reglas de las alertas y del No. de control; </w:t>
+      </w:r>
+      <w:r>
+        <w:rPr>
+          <w:rStyle w:val="HTMLCode"/>
+        </w:rPr>
+        <w:t>AvisosTest.kt</w:t>
+      </w:r>
+      <w:r>
+        <w:rPr>
+          <w:rFonts w:ascii="Calibri" w:eastAsia="Times New Roman" w:hAnsi="Calibri" w:cs="Calibri"/>
+          <w:color w:val="1F1A1A"/>
+          <w:sz w:val="22"/>
+          <w:szCs w:val="22"/>
+        </w:rPr>
+        <w:t xml:space="preserve">, a quién se avisa y cómo se arma el aviso. Se corren con </w:t>
+      </w:r>
+      <w:r>
+        <w:rPr>
+          <w:rStyle w:val="HTMLCode"/>
+        </w:rPr>
+        <w:t>./gradlew.bat :app:testDebugUnitTest</w:t>
+      </w:r>
+      <w:r>
+        <w:rPr>
+          <w:rFonts w:ascii="Calibri" w:eastAsia="Times New Roman" w:hAnsi="Calibri" w:cs="Calibri"/>
+          <w:color w:val="1F1A1A"/>
+          <w:sz w:val="22"/>
+          <w:szCs w:val="22"/>
+        </w:rPr>
+        <w:t xml:space="preserve">. Las reglas de Firestore tienen sus propias pruebas en </w:t>
+      </w:r>
+      <w:r>
+        <w:rPr>
+          <w:rStyle w:val="HTMLCode"/>
+        </w:rPr>
+        <w:t>firebase/pruebas-reglas</w:t>
+      </w:r>
+      <w:r>
+        <w:rPr>
+          <w:rFonts w:ascii="Calibri" w:eastAsia="Times New Roman" w:hAnsi="Calibri" w:cs="Calibri"/>
+          <w:color w:val="1F1A1A"/>
+          <w:sz w:val="22"/>
+          <w:szCs w:val="22"/>
+        </w:rPr>
+        <w:t xml:space="preserve"> (necesitan Node.js).</w:t>
+      </w:r>
+    </w:p>
+    <w:p>
+      <w:pPr>
+        <w:rPr>
+          <w:rFonts w:ascii="Calibri" w:eastAsia="Times New Roman" w:hAnsi="Calibri" w:cs="Calibri"/>
+          <w:color w:val="1F1A1A"/>
+          <w:sz w:val="22"/>
+          <w:szCs w:val="22"/>
+        </w:rPr>
+      </w:pPr>
+      <w:r>
+        <w:rPr>
+          <w:rFonts w:ascii="Calibri" w:eastAsia="Times New Roman" w:hAnsi="Calibri" w:cs="Calibri"/>
+          <w:color w:val="1F1A1A"/>
+          <w:sz w:val="22"/>
+          <w:szCs w:val="22"/>
+        </w:rPr>
+        <w:pict w14:anchorId="02898FB5">
           <v:rect id="_x0000_i1035" style="width:0;height:1.5pt" o:hralign="center" o:hrstd="t" o:hr="t" fillcolor="#a0a0a0" stroked="f"/>
         </w:pict>
       </w:r>
@@ -15163,16 +15142,7 @@
           <w:sz w:val="22"/>
           <w:szCs w:val="22"/>
         </w:rPr>
-        <w:t>n juntos y sin repetir en</w:t>
-      </w:r>
-      <w:r>
-        <w:rPr>
-          <w:rFonts w:ascii="Calibri" w:hAnsi="Calibri" w:cs="Calibri"/>
-          <w:color w:val="1F1A1A"/>
-          <w:sz w:val="22"/>
-          <w:szCs w:val="22"/>
-        </w:rPr>
-        <w:t xml:space="preserve"> </w:t>
+        <w:t xml:space="preserve">n juntos y sin repetir en </w:t>
       </w:r>
       <w:hyperlink r:id="rId20" w:history="1">
         <w:r>
@@ -15328,7 +15298,7 @@
           <w:sz w:val="22"/>
           <w:szCs w:val="22"/>
         </w:rPr>
-        <w:pict w14:anchorId="50588ABB">
+        <w:pict w14:anchorId="725AB5AB">
           <v:rect id="_x0000_i1036" style="width:0;height:1.5pt" o:hralign="center" o:hrstd="t" o:hr="t" fillcolor="#a0a0a0" stroked="f"/>
         </w:pict>
       </w:r>
@@ -16463,9 +16433,348 @@
 <file path=word/numbering.xml><?xml version="1.0" encoding="utf-8"?>
 <w:numbering xmlns:wpc="http://schemas.microsoft.com/office/word/2010/wordprocessingCanvas" xmlns:cx="http://schemas.microsoft.com/office/drawing/2014/chartex" xmlns:cx1="http://schemas.microsoft.com/office/drawing/2015/9/8/chartex" xmlns:cx2="http://schemas.microsoft.com/office/drawing/2015/10/21/chartex" xmlns:cx3="http://schemas.microsoft.com/office/drawing/2016/5/9/chartex" xmlns:cx4="http://schemas.microsoft.com/office/drawing/2016/5/10/chartex" xmlns:cx5="http://schemas.microsoft.com/office/drawing/2016/5/11/chartex" xmlns:cx6="http://schemas.microsoft.com/office/drawing/2016/5/12/chartex" xmlns:cx7="http://schemas.microsoft.com/office/drawing/2016/5/13/chartex" xmlns:cx8="http://schemas.microsoft.com/office/drawing/2016/5/14/chartex" xmlns:mc="http://schemas.openxmlformats.org/markup-compatibility/2006" xmlns:aink="http://schemas.microsoft.com/office/drawing/2016/ink" xmlns:am3d="http://schemas.microsoft.com/office/drawing/2017/model3d" xmlns:o="urn:schemas-microsoft-com:office:office" xmlns:oel="http://schemas.microsoft.com/office/2019/extlst" xmlns:r="http://schemas.openxmlformats.org/officeDocument/2006/relationships" xmlns:m="http://schemas.openxmlformats.org/officeDocument/2006/math" xmlns:v="urn:schemas-microsoft-com:vml" xmlns:wp14="http://schemas.microsoft.com/office/word/2010/wordprocessingDrawing" xmlns:wp="http://schemas.openxmlformats.org/drawingml/2006/wordprocessingDrawing" xmlns:w10="urn:schemas-microsoft-com:office:word" xmlns:w="http://schemas.openxmlformats.org/wordprocessingml/2006/main" xmlns:w14="http://schemas.microsoft.com/office/word/2010/wordml" xmlns:w15="http://schemas.microsoft.com/office/word/2012/wordml" xmlns:w16cex="http://schemas.microsoft.com/office/word/2018/wordml/cex" xmlns:w16cid="http://schemas.microsoft.com/office/word/2016/wordml/cid" xmlns:w16="http://schemas.microsoft.com/office/word/2018/wordml" xmlns:w16du="http://schemas.microsoft.com/office/word/2023/wordml/word16du" xmlns:w16sdtdh="http://schemas.microsoft.com/office/word/2020/wordml/sdtdatahash" xmlns:w16sdtfl="http://schemas.microsoft.com/office/word/2024/wordml/sdtformatlock" xmlns:w16se="http://schemas.microsoft.com/office/word/2015/wordml/symex" xmlns:wpg="http://schemas.microsoft.com/office/word/2010/wordprocessingGroup" xmlns:wpi="http://schemas.microsoft.com/office/word/2010/wordprocessingInk" xmlns:wne="http://schemas.microsoft.com/office/word/2006/wordml" xmlns:wps="http://schemas.microsoft.com/office/word/2010/wordprocessingShape" mc:Ignorable="w14 w15 w16se w16cid w16 w16cex w16sdtdh w16sdtfl w16du wp14">
   <w:abstractNum w:abstractNumId="0" w15:restartNumberingAfterBreak="0">
-    <w:nsid w:val="14583149"/>
+    <w:nsid w:val="020E7245"/>
     <w:multiLevelType w:val="multilevel"/>
-    <w:tmpl w:val="0E0C62A4"/>
+    <w:tmpl w:val="1A4ADFE4"/>
+    <w:lvl w:ilvl="0">
+      <w:start w:val="1"/>
+      <w:numFmt w:val="decimal"/>
+      <w:lvlText w:val="%1."/>
+      <w:lvlJc w:val="left"/>
+      <w:pPr>
+        <w:tabs>
+          <w:tab w:val="num" w:pos="720"/>
+        </w:tabs>
+        <w:ind w:left="720" w:hanging="360"/>
+      </w:pPr>
+    </w:lvl>
+    <w:lvl w:ilvl="1" w:tentative="1">
+      <w:start w:val="1"/>
+      <w:numFmt w:val="decimal"/>
+      <w:lvlText w:val="%2."/>
+      <w:lvlJc w:val="left"/>
+      <w:pPr>
+        <w:tabs>
+          <w:tab w:val="num" w:pos="1440"/>
+        </w:tabs>
+        <w:ind w:left="1440" w:hanging="360"/>
+      </w:pPr>
+    </w:lvl>
+    <w:lvl w:ilvl="2" w:tentative="1">
+      <w:start w:val="1"/>
+      <w:numFmt w:val="decimal"/>
+      <w:lvlText w:val="%3."/>
+      <w:lvlJc w:val="left"/>
+      <w:pPr>
+        <w:tabs>
+          <w:tab w:val="num" w:pos="2160"/>
+        </w:tabs>
+        <w:ind w:left="2160" w:hanging="360"/>
+      </w:pPr>
+    </w:lvl>
+    <w:lvl w:ilvl="3" w:tentative="1">
+      <w:start w:val="1"/>
+      <w:numFmt w:val="decimal"/>
+      <w:lvlText w:val="%4."/>
+      <w:lvlJc w:val="left"/>
+      <w:pPr>
+        <w:tabs>
+          <w:tab w:val="num" w:pos="2880"/>
+        </w:tabs>
+        <w:ind w:left="2880" w:hanging="360"/>
+      </w:pPr>
+    </w:lvl>
+    <w:lvl w:ilvl="4" w:tentative="1">
+      <w:start w:val="1"/>
+      <w:numFmt w:val="decimal"/>
+      <w:lvlText w:val="%5."/>
+      <w:lvlJc w:val="left"/>
+      <w:pPr>
+        <w:tabs>
+          <w:tab w:val="num" w:pos="3600"/>
+        </w:tabs>
+        <w:ind w:left="3600" w:hanging="360"/>
+      </w:pPr>
+    </w:lvl>
+    <w:lvl w:ilvl="5" w:tentative="1">
+      <w:start w:val="1"/>
+      <w:numFmt w:val="decimal"/>
+      <w:lvlText w:val="%6."/>
+      <w:lvlJc w:val="left"/>
+      <w:pPr>
+        <w:tabs>
+          <w:tab w:val="num" w:pos="4320"/>
+        </w:tabs>
+        <w:ind w:left="4320" w:hanging="360"/>
+      </w:pPr>
+    </w:lvl>
+    <w:lvl w:ilvl="6" w:tentative="1">
+      <w:start w:val="1"/>
+      <w:numFmt w:val="decimal"/>
+      <w:lvlText w:val="%7."/>
+      <w:lvlJc w:val="left"/>
+      <w:pPr>
+        <w:tabs>
+          <w:tab w:val="num" w:pos="5040"/>
+        </w:tabs>
+        <w:ind w:left="5040" w:hanging="360"/>
+      </w:pPr>
+    </w:lvl>
+    <w:lvl w:ilvl="7" w:tentative="1">
+      <w:start w:val="1"/>
+      <w:numFmt w:val="decimal"/>
+      <w:lvlText w:val="%8."/>
+      <w:lvlJc w:val="left"/>
+      <w:pPr>
+        <w:tabs>
+          <w:tab w:val="num" w:pos="5760"/>
+        </w:tabs>
+        <w:ind w:left="5760" w:hanging="360"/>
+      </w:pPr>
+    </w:lvl>
+    <w:lvl w:ilvl="8" w:tentative="1">
+      <w:start w:val="1"/>
+      <w:numFmt w:val="decimal"/>
+      <w:lvlText w:val="%9."/>
+      <w:lvlJc w:val="left"/>
+      <w:pPr>
+        <w:tabs>
+          <w:tab w:val="num" w:pos="6480"/>
+        </w:tabs>
+        <w:ind w:left="6480" w:hanging="360"/>
+      </w:pPr>
+    </w:lvl>
+  </w:abstractNum>
+  <w:abstractNum w:abstractNumId="1" w15:restartNumberingAfterBreak="0">
+    <w:nsid w:val="06831098"/>
+    <w:multiLevelType w:val="multilevel"/>
+    <w:tmpl w:val="777A12E6"/>
+    <w:lvl w:ilvl="0">
+      <w:start w:val="1"/>
+      <w:numFmt w:val="decimal"/>
+      <w:lvlText w:val="%1."/>
+      <w:lvlJc w:val="left"/>
+      <w:pPr>
+        <w:tabs>
+          <w:tab w:val="num" w:pos="720"/>
+        </w:tabs>
+        <w:ind w:left="720" w:hanging="360"/>
+      </w:pPr>
+    </w:lvl>
+    <w:lvl w:ilvl="1" w:tentative="1">
+      <w:start w:val="1"/>
+      <w:numFmt w:val="decimal"/>
+      <w:lvlText w:val="%2."/>
+      <w:lvlJc w:val="left"/>
+      <w:pPr>
+        <w:tabs>
+          <w:tab w:val="num" w:pos="1440"/>
+        </w:tabs>
+        <w:ind w:left="1440" w:hanging="360"/>
+      </w:pPr>
+    </w:lvl>
+    <w:lvl w:ilvl="2" w:tentative="1">
+      <w:start w:val="1"/>
+      <w:numFmt w:val="decimal"/>
+      <w:lvlText w:val="%3."/>
+      <w:lvlJc w:val="left"/>
+      <w:pPr>
+        <w:tabs>
+          <w:tab w:val="num" w:pos="2160"/>
+        </w:tabs>
+        <w:ind w:left="2160" w:hanging="360"/>
+      </w:pPr>
+    </w:lvl>
+    <w:lvl w:ilvl="3" w:tentative="1">
+      <w:start w:val="1"/>
+      <w:numFmt w:val="decimal"/>
+      <w:lvlText w:val="%4."/>
+      <w:lvlJc w:val="left"/>
+      <w:pPr>
+        <w:tabs>
+          <w:tab w:val="num" w:pos="2880"/>
+        </w:tabs>
+        <w:ind w:left="2880" w:hanging="360"/>
+      </w:pPr>
+    </w:lvl>
+    <w:lvl w:ilvl="4" w:tentative="1">
+      <w:start w:val="1"/>
+      <w:numFmt w:val="decimal"/>
+      <w:lvlText w:val="%5."/>
+      <w:lvlJc w:val="left"/>
+      <w:pPr>
+        <w:tabs>
+          <w:tab w:val="num" w:pos="3600"/>
+        </w:tabs>
+        <w:ind w:left="3600" w:hanging="360"/>
+      </w:pPr>
+    </w:lvl>
+    <w:lvl w:ilvl="5" w:tentative="1">
+      <w:start w:val="1"/>
+      <w:numFmt w:val="decimal"/>
+      <w:lvlText w:val="%6."/>
+      <w:lvlJc w:val="left"/>
+      <w:pPr>
+        <w:tabs>
+          <w:tab w:val="num" w:pos="4320"/>
+        </w:tabs>
+        <w:ind w:left="4320" w:hanging="360"/>
+      </w:pPr>
+    </w:lvl>
+    <w:lvl w:ilvl="6" w:tentative="1">
+      <w:start w:val="1"/>
+      <w:numFmt w:val="decimal"/>
+      <w:lvlText w:val="%7."/>
+      <w:lvlJc w:val="left"/>
+      <w:pPr>
+        <w:tabs>
+          <w:tab w:val="num" w:pos="5040"/>
+        </w:tabs>
+        <w:ind w:left="5040" w:hanging="360"/>
+      </w:pPr>
+    </w:lvl>
+    <w:lvl w:ilvl="7" w:tentative="1">
+      <w:start w:val="1"/>
+      <w:numFmt w:val="decimal"/>
+      <w:lvlText w:val="%8."/>
+      <w:lvlJc w:val="left"/>
+      <w:pPr>
+        <w:tabs>
+          <w:tab w:val="num" w:pos="5760"/>
+        </w:tabs>
+        <w:ind w:left="5760" w:hanging="360"/>
+      </w:pPr>
+    </w:lvl>
+    <w:lvl w:ilvl="8" w:tentative="1">
+      <w:start w:val="1"/>
+      <w:numFmt w:val="decimal"/>
+      <w:lvlText w:val="%9."/>
+      <w:lvlJc w:val="left"/>
+      <w:pPr>
+        <w:tabs>
+          <w:tab w:val="num" w:pos="6480"/>
+        </w:tabs>
+        <w:ind w:left="6480" w:hanging="360"/>
+      </w:pPr>
+    </w:lvl>
+  </w:abstractNum>
+  <w:abstractNum w:abstractNumId="2" w15:restartNumberingAfterBreak="0">
+    <w:nsid w:val="235C4944"/>
+    <w:multiLevelType w:val="multilevel"/>
+    <w:tmpl w:val="18861376"/>
+    <w:lvl w:ilvl="0">
+      <w:start w:val="4"/>
+      <w:numFmt w:val="decimal"/>
+      <w:lvlText w:val="%1."/>
+      <w:lvlJc w:val="left"/>
+      <w:pPr>
+        <w:tabs>
+          <w:tab w:val="num" w:pos="720"/>
+        </w:tabs>
+        <w:ind w:left="720" w:hanging="360"/>
+      </w:pPr>
+    </w:lvl>
+    <w:lvl w:ilvl="1" w:tentative="1">
+      <w:start w:val="1"/>
+      <w:numFmt w:val="decimal"/>
+      <w:lvlText w:val="%2."/>
+      <w:lvlJc w:val="left"/>
+      <w:pPr>
+        <w:tabs>
+          <w:tab w:val="num" w:pos="1440"/>
+        </w:tabs>
+        <w:ind w:left="1440" w:hanging="360"/>
+      </w:pPr>
+    </w:lvl>
+    <w:lvl w:ilvl="2" w:tentative="1">
+      <w:start w:val="1"/>
+      <w:numFmt w:val="decimal"/>
+      <w:lvlText w:val="%3."/>
+      <w:lvlJc w:val="left"/>
+      <w:pPr>
+        <w:tabs>
+          <w:tab w:val="num" w:pos="2160"/>
+        </w:tabs>
+        <w:ind w:left="2160" w:hanging="360"/>
+      </w:pPr>
+    </w:lvl>
+    <w:lvl w:ilvl="3" w:tentative="1">
+      <w:start w:val="1"/>
+      <w:numFmt w:val="decimal"/>
+      <w:lvlText w:val="%4."/>
+      <w:lvlJc w:val="left"/>
+      <w:pPr>
+        <w:tabs>
+          <w:tab w:val="num" w:pos="2880"/>
+        </w:tabs>
+        <w:ind w:left="2880" w:hanging="360"/>
+      </w:pPr>
+    </w:lvl>
+    <w:lvl w:ilvl="4" w:tentative="1">
+      <w:start w:val="1"/>
+      <w:numFmt w:val="decimal"/>
+      <w:lvlText w:val="%5."/>
+      <w:lvlJc w:val="left"/>
+      <w:pPr>
+        <w:tabs>
+          <w:tab w:val="num" w:pos="3600"/>
+        </w:tabs>
+        <w:ind w:left="3600" w:hanging="360"/>
+      </w:pPr>
+    </w:lvl>
+    <w:lvl w:ilvl="5" w:tentative="1">
+      <w:start w:val="1"/>
+      <w:numFmt w:val="decimal"/>
+      <w:lvlText w:val="%6."/>
+      <w:lvlJc w:val="left"/>
+      <w:pPr>
+        <w:tabs>
+          <w:tab w:val="num" w:pos="4320"/>
+        </w:tabs>
+        <w:ind w:left="4320" w:hanging="360"/>
+      </w:pPr>
+    </w:lvl>
+    <w:lvl w:ilvl="6" w:tentative="1">
+      <w:start w:val="1"/>
+      <w:numFmt w:val="decimal"/>
+      <w:lvlText w:val="%7."/>
+      <w:lvlJc w:val="left"/>
+      <w:pPr>
+        <w:tabs>
+          <w:tab w:val="num" w:pos="5040"/>
+        </w:tabs>
+        <w:ind w:left="5040" w:hanging="360"/>
+      </w:pPr>
+    </w:lvl>
+    <w:lvl w:ilvl="7" w:tentative="1">
+      <w:start w:val="1"/>
+      <w:numFmt w:val="decimal"/>
+      <w:lvlText w:val="%8."/>
+      <w:lvlJc w:val="left"/>
+      <w:pPr>
+        <w:tabs>
+          <w:tab w:val="num" w:pos="5760"/>
+        </w:tabs>
+        <w:ind w:left="5760" w:hanging="360"/>
+      </w:pPr>
+    </w:lvl>
+    <w:lvl w:ilvl="8" w:tentative="1">
+      <w:start w:val="1"/>
+      <w:numFmt w:val="decimal"/>
+      <w:lvlText w:val="%9."/>
+      <w:lvlJc w:val="left"/>
+      <w:pPr>
+        <w:tabs>
+          <w:tab w:val="num" w:pos="6480"/>
+        </w:tabs>
+        <w:ind w:left="6480" w:hanging="360"/>
+      </w:pPr>
+    </w:lvl>
+  </w:abstractNum>
+  <w:abstractNum w:abstractNumId="3" w15:restartNumberingAfterBreak="0">
+    <w:nsid w:val="33A31F2F"/>
+    <w:multiLevelType w:val="multilevel"/>
+    <w:tmpl w:val="F45CF6B8"/>
     <w:lvl w:ilvl="0">
       <w:start w:val="1"/>
       <w:numFmt w:val="bullet"/>
@@ -16611,10 +16920,647 @@
       </w:rPr>
     </w:lvl>
   </w:abstractNum>
-  <w:abstractNum w:abstractNumId="1" w15:restartNumberingAfterBreak="0">
-    <w:nsid w:val="163119A7"/>
+  <w:abstractNum w:abstractNumId="4" w15:restartNumberingAfterBreak="0">
+    <w:nsid w:val="471129C0"/>
     <w:multiLevelType w:val="multilevel"/>
-    <w:tmpl w:val="9EE68EB6"/>
+    <w:tmpl w:val="DDE88D54"/>
+    <w:lvl w:ilvl="0">
+      <w:start w:val="1"/>
+      <w:numFmt w:val="decimal"/>
+      <w:lvlText w:val="%1."/>
+      <w:lvlJc w:val="left"/>
+      <w:pPr>
+        <w:tabs>
+          <w:tab w:val="num" w:pos="720"/>
+        </w:tabs>
+        <w:ind w:left="720" w:hanging="360"/>
+      </w:pPr>
+    </w:lvl>
+    <w:lvl w:ilvl="1" w:tentative="1">
+      <w:start w:val="1"/>
+      <w:numFmt w:val="decimal"/>
+      <w:lvlText w:val="%2."/>
+      <w:lvlJc w:val="left"/>
+      <w:pPr>
+        <w:tabs>
+          <w:tab w:val="num" w:pos="1440"/>
+        </w:tabs>
+        <w:ind w:left="1440" w:hanging="360"/>
+      </w:pPr>
+    </w:lvl>
+    <w:lvl w:ilvl="2" w:tentative="1">
+      <w:start w:val="1"/>
+      <w:numFmt w:val="decimal"/>
+      <w:lvlText w:val="%3."/>
+      <w:lvlJc w:val="left"/>
+      <w:pPr>
+        <w:tabs>
+          <w:tab w:val="num" w:pos="2160"/>
+        </w:tabs>
+        <w:ind w:left="2160" w:hanging="360"/>
+      </w:pPr>
+    </w:lvl>
+    <w:lvl w:ilvl="3" w:tentative="1">
+      <w:start w:val="1"/>
+      <w:numFmt w:val="decimal"/>
+      <w:lvlText w:val="%4."/>
+      <w:lvlJc w:val="left"/>
+      <w:pPr>
+        <w:tabs>
+          <w:tab w:val="num" w:pos="2880"/>
+        </w:tabs>
+        <w:ind w:left="2880" w:hanging="360"/>
+      </w:pPr>
+    </w:lvl>
+    <w:lvl w:ilvl="4" w:tentative="1">
+      <w:start w:val="1"/>
+      <w:numFmt w:val="decimal"/>
+      <w:lvlText w:val="%5."/>
+      <w:lvlJc w:val="left"/>
+      <w:pPr>
+        <w:tabs>
+          <w:tab w:val="num" w:pos="3600"/>
+        </w:tabs>
+        <w:ind w:left="3600" w:hanging="360"/>
+      </w:pPr>
+    </w:lvl>
+    <w:lvl w:ilvl="5" w:tentative="1">
+      <w:start w:val="1"/>
+      <w:numFmt w:val="decimal"/>
+      <w:lvlText w:val="%6."/>
+      <w:lvlJc w:val="left"/>
+      <w:pPr>
+        <w:tabs>
+          <w:tab w:val="num" w:pos="4320"/>
+        </w:tabs>
+        <w:ind w:left="4320" w:hanging="360"/>
+      </w:pPr>
+    </w:lvl>
+    <w:lvl w:ilvl="6" w:tentative="1">
+      <w:start w:val="1"/>
+      <w:numFmt w:val="decimal"/>
+      <w:lvlText w:val="%7."/>
+      <w:lvlJc w:val="left"/>
+      <w:pPr>
+        <w:tabs>
+          <w:tab w:val="num" w:pos="5040"/>
+        </w:tabs>
+        <w:ind w:left="5040" w:hanging="360"/>
+      </w:pPr>
+    </w:lvl>
+    <w:lvl w:ilvl="7" w:tentative="1">
+      <w:start w:val="1"/>
+      <w:numFmt w:val="decimal"/>
+      <w:lvlText w:val="%8."/>
+      <w:lvlJc w:val="left"/>
+      <w:pPr>
+        <w:tabs>
+          <w:tab w:val="num" w:pos="5760"/>
+        </w:tabs>
+        <w:ind w:left="5760" w:hanging="360"/>
+      </w:pPr>
+    </w:lvl>
+    <w:lvl w:ilvl="8" w:tentative="1">
+      <w:start w:val="1"/>
+      <w:numFmt w:val="decimal"/>
+      <w:lvlText w:val="%9."/>
+      <w:lvlJc w:val="left"/>
+      <w:pPr>
+        <w:tabs>
+          <w:tab w:val="num" w:pos="6480"/>
+        </w:tabs>
+        <w:ind w:left="6480" w:hanging="360"/>
+      </w:pPr>
+    </w:lvl>
+  </w:abstractNum>
+  <w:abstractNum w:abstractNumId="5" w15:restartNumberingAfterBreak="0">
+    <w:nsid w:val="47CF239F"/>
+    <w:multiLevelType w:val="multilevel"/>
+    <w:tmpl w:val="8DCC63DA"/>
+    <w:lvl w:ilvl="0">
+      <w:start w:val="1"/>
+      <w:numFmt w:val="bullet"/>
+      <w:lvlText w:val=""/>
+      <w:lvlJc w:val="left"/>
+      <w:pPr>
+        <w:tabs>
+          <w:tab w:val="num" w:pos="720"/>
+        </w:tabs>
+        <w:ind w:left="720" w:hanging="360"/>
+      </w:pPr>
+      <w:rPr>
+        <w:rFonts w:ascii="Symbol" w:hAnsi="Symbol" w:hint="default"/>
+        <w:sz w:val="20"/>
+      </w:rPr>
+    </w:lvl>
+    <w:lvl w:ilvl="1" w:tentative="1">
+      <w:start w:val="1"/>
+      <w:numFmt w:val="bullet"/>
+      <w:lvlText w:val="o"/>
+      <w:lvlJc w:val="left"/>
+      <w:pPr>
+        <w:tabs>
+          <w:tab w:val="num" w:pos="1440"/>
+        </w:tabs>
+        <w:ind w:left="1440" w:hanging="360"/>
+      </w:pPr>
+      <w:rPr>
+        <w:rFonts w:ascii="Courier New" w:hAnsi="Courier New" w:hint="default"/>
+        <w:sz w:val="20"/>
+      </w:rPr>
+    </w:lvl>
+    <w:lvl w:ilvl="2" w:tentative="1">
+      <w:start w:val="1"/>
+      <w:numFmt w:val="bullet"/>
+      <w:lvlText w:val=""/>
+      <w:lvlJc w:val="left"/>
+      <w:pPr>
+        <w:tabs>
+          <w:tab w:val="num" w:pos="2160"/>
+        </w:tabs>
+        <w:ind w:left="2160" w:hanging="360"/>
+      </w:pPr>
+      <w:rPr>
+        <w:rFonts w:ascii="Wingdings" w:hAnsi="Wingdings" w:hint="default"/>
+        <w:sz w:val="20"/>
+      </w:rPr>
+    </w:lvl>
+    <w:lvl w:ilvl="3" w:tentative="1">
+      <w:start w:val="1"/>
+      <w:numFmt w:val="bullet"/>
+      <w:lvlText w:val=""/>
+      <w:lvlJc w:val="left"/>
+      <w:pPr>
+        <w:tabs>
+          <w:tab w:val="num" w:pos="2880"/>
+        </w:tabs>
+        <w:ind w:left="2880" w:hanging="360"/>
+      </w:pPr>
+      <w:rPr>
+        <w:rFonts w:ascii="Wingdings" w:hAnsi="Wingdings" w:hint="default"/>
+        <w:sz w:val="20"/>
+      </w:rPr>
+    </w:lvl>
+    <w:lvl w:ilvl="4" w:tentative="1">
+      <w:start w:val="1"/>
+      <w:numFmt w:val="bullet"/>
+      <w:lvlText w:val=""/>
+      <w:lvlJc w:val="left"/>
+      <w:pPr>
+        <w:tabs>
+          <w:tab w:val="num" w:pos="3600"/>
+        </w:tabs>
+        <w:ind w:left="3600" w:hanging="360"/>
+      </w:pPr>
+      <w:rPr>
+        <w:rFonts w:ascii="Wingdings" w:hAnsi="Wingdings" w:hint="default"/>
+        <w:sz w:val="20"/>
+      </w:rPr>
+    </w:lvl>
+    <w:lvl w:ilvl="5" w:tentative="1">
+      <w:start w:val="1"/>
+      <w:numFmt w:val="bullet"/>
+      <w:lvlText w:val=""/>
+      <w:lvlJc w:val="left"/>
+      <w:pPr>
+        <w:tabs>
+          <w:tab w:val="num" w:pos="4320"/>
+        </w:tabs>
+        <w:ind w:left="4320" w:hanging="360"/>
+      </w:pPr>
+      <w:rPr>
+        <w:rFonts w:ascii="Wingdings" w:hAnsi="Wingdings" w:hint="default"/>
+        <w:sz w:val="20"/>
+      </w:rPr>
+    </w:lvl>
+    <w:lvl w:ilvl="6" w:tentative="1">
+      <w:start w:val="1"/>
+      <w:numFmt w:val="bullet"/>
+      <w:lvlText w:val=""/>
+      <w:lvlJc w:val="left"/>
+      <w:pPr>
+        <w:tabs>
+          <w:tab w:val="num" w:pos="5040"/>
+        </w:tabs>
+        <w:ind w:left="5040" w:hanging="360"/>
+      </w:pPr>
+      <w:rPr>
+        <w:rFonts w:ascii="Wingdings" w:hAnsi="Wingdings" w:hint="default"/>
+        <w:sz w:val="20"/>
+      </w:rPr>
+    </w:lvl>
+    <w:lvl w:ilvl="7" w:tentative="1">
+      <w:start w:val="1"/>
+      <w:numFmt w:val="bullet"/>
+      <w:lvlText w:val=""/>
+      <w:lvlJc w:val="left"/>
+      <w:pPr>
+        <w:tabs>
+          <w:tab w:val="num" w:pos="5760"/>
+        </w:tabs>
+        <w:ind w:left="5760" w:hanging="360"/>
+      </w:pPr>
+      <w:rPr>
+        <w:rFonts w:ascii="Wingdings" w:hAnsi="Wingdings" w:hint="default"/>
+        <w:sz w:val="20"/>
+      </w:rPr>
+    </w:lvl>
+    <w:lvl w:ilvl="8" w:tentative="1">
+      <w:start w:val="1"/>
+      <w:numFmt w:val="bullet"/>
+      <w:lvlText w:val=""/>
+      <w:lvlJc w:val="left"/>
+      <w:pPr>
+        <w:tabs>
+          <w:tab w:val="num" w:pos="6480"/>
+        </w:tabs>
+        <w:ind w:left="6480" w:hanging="360"/>
+      </w:pPr>
+      <w:rPr>
+        <w:rFonts w:ascii="Wingdings" w:hAnsi="Wingdings" w:hint="default"/>
+        <w:sz w:val="20"/>
+      </w:rPr>
+    </w:lvl>
+  </w:abstractNum>
+  <w:abstractNum w:abstractNumId="6" w15:restartNumberingAfterBreak="0">
+    <w:nsid w:val="48180137"/>
+    <w:multiLevelType w:val="multilevel"/>
+    <w:tmpl w:val="75E2F526"/>
+    <w:lvl w:ilvl="0">
+      <w:start w:val="1"/>
+      <w:numFmt w:val="bullet"/>
+      <w:lvlText w:val=""/>
+      <w:lvlJc w:val="left"/>
+      <w:pPr>
+        <w:tabs>
+          <w:tab w:val="num" w:pos="720"/>
+        </w:tabs>
+        <w:ind w:left="720" w:hanging="360"/>
+      </w:pPr>
+      <w:rPr>
+        <w:rFonts w:ascii="Symbol" w:hAnsi="Symbol" w:hint="default"/>
+        <w:sz w:val="20"/>
+      </w:rPr>
+    </w:lvl>
+    <w:lvl w:ilvl="1" w:tentative="1">
+      <w:start w:val="1"/>
+      <w:numFmt w:val="bullet"/>
+      <w:lvlText w:val="o"/>
+      <w:lvlJc w:val="left"/>
+      <w:pPr>
+        <w:tabs>
+          <w:tab w:val="num" w:pos="1440"/>
+        </w:tabs>
+        <w:ind w:left="1440" w:hanging="360"/>
+      </w:pPr>
+      <w:rPr>
+        <w:rFonts w:ascii="Courier New" w:hAnsi="Courier New" w:hint="default"/>
+        <w:sz w:val="20"/>
+      </w:rPr>
+    </w:lvl>
+    <w:lvl w:ilvl="2" w:tentative="1">
+      <w:start w:val="1"/>
+      <w:numFmt w:val="bullet"/>
+      <w:lvlText w:val=""/>
+      <w:lvlJc w:val="left"/>
+      <w:pPr>
+        <w:tabs>
+          <w:tab w:val="num" w:pos="2160"/>
+        </w:tabs>
+        <w:ind w:left="2160" w:hanging="360"/>
+      </w:pPr>
+      <w:rPr>
+        <w:rFonts w:ascii="Wingdings" w:hAnsi="Wingdings" w:hint="default"/>
+        <w:sz w:val="20"/>
+      </w:rPr>
+    </w:lvl>
+    <w:lvl w:ilvl="3" w:tentative="1">
+      <w:start w:val="1"/>
+      <w:numFmt w:val="bullet"/>
+      <w:lvlText w:val=""/>
+      <w:lvlJc w:val="left"/>
+      <w:pPr>
+        <w:tabs>
+          <w:tab w:val="num" w:pos="2880"/>
+        </w:tabs>
+        <w:ind w:left="2880" w:hanging="360"/>
+      </w:pPr>
+      <w:rPr>
+        <w:rFonts w:ascii="Wingdings" w:hAnsi="Wingdings" w:hint="default"/>
+        <w:sz w:val="20"/>
+      </w:rPr>
+    </w:lvl>
+    <w:lvl w:ilvl="4" w:tentative="1">
+      <w:start w:val="1"/>
+      <w:numFmt w:val="bullet"/>
+      <w:lvlText w:val=""/>
+      <w:lvlJc w:val="left"/>
+      <w:pPr>
+        <w:tabs>
+          <w:tab w:val="num" w:pos="3600"/>
+        </w:tabs>
+        <w:ind w:left="3600" w:hanging="360"/>
+      </w:pPr>
+      <w:rPr>
+        <w:rFonts w:ascii="Wingdings" w:hAnsi="Wingdings" w:hint="default"/>
+        <w:sz w:val="20"/>
+      </w:rPr>
+    </w:lvl>
+    <w:lvl w:ilvl="5" w:tentative="1">
+      <w:start w:val="1"/>
+      <w:numFmt w:val="bullet"/>
+      <w:lvlText w:val=""/>
+      <w:lvlJc w:val="left"/>
+      <w:pPr>
+        <w:tabs>
+          <w:tab w:val="num" w:pos="4320"/>
+        </w:tabs>
+        <w:ind w:left="4320" w:hanging="360"/>
+      </w:pPr>
+      <w:rPr>
+        <w:rFonts w:ascii="Wingdings" w:hAnsi="Wingdings" w:hint="default"/>
+        <w:sz w:val="20"/>
+      </w:rPr>
+    </w:lvl>
+    <w:lvl w:ilvl="6" w:tentative="1">
+      <w:start w:val="1"/>
+      <w:numFmt w:val="bullet"/>
+      <w:lvlText w:val=""/>
+      <w:lvlJc w:val="left"/>
+      <w:pPr>
+        <w:tabs>
+          <w:tab w:val="num" w:pos="5040"/>
+        </w:tabs>
+        <w:ind w:left="5040" w:hanging="360"/>
+      </w:pPr>
+      <w:rPr>
+        <w:rFonts w:ascii="Wingdings" w:hAnsi="Wingdings" w:hint="default"/>
+        <w:sz w:val="20"/>
+      </w:rPr>
+    </w:lvl>
+    <w:lvl w:ilvl="7" w:tentative="1">
+      <w:start w:val="1"/>
+      <w:numFmt w:val="bullet"/>
+      <w:lvlText w:val=""/>
+      <w:lvlJc w:val="left"/>
+      <w:pPr>
+        <w:tabs>
+          <w:tab w:val="num" w:pos="5760"/>
+        </w:tabs>
+        <w:ind w:left="5760" w:hanging="360"/>
+      </w:pPr>
+      <w:rPr>
+        <w:rFonts w:ascii="Wingdings" w:hAnsi="Wingdings" w:hint="default"/>
+        <w:sz w:val="20"/>
+      </w:rPr>
+    </w:lvl>
+    <w:lvl w:ilvl="8" w:tentative="1">
+      <w:start w:val="1"/>
+      <w:numFmt w:val="bullet"/>
+      <w:lvlText w:val=""/>
+      <w:lvlJc w:val="left"/>
+      <w:pPr>
+        <w:tabs>
+          <w:tab w:val="num" w:pos="6480"/>
+        </w:tabs>
+        <w:ind w:left="6480" w:hanging="360"/>
+      </w:pPr>
+      <w:rPr>
+        <w:rFonts w:ascii="Wingdings" w:hAnsi="Wingdings" w:hint="default"/>
+        <w:sz w:val="20"/>
+      </w:rPr>
+    </w:lvl>
+  </w:abstractNum>
+  <w:abstractNum w:abstractNumId="7" w15:restartNumberingAfterBreak="0">
+    <w:nsid w:val="5B6C0A62"/>
+    <w:multiLevelType w:val="multilevel"/>
+    <w:tmpl w:val="F4A01E1C"/>
+    <w:lvl w:ilvl="0">
+      <w:start w:val="1"/>
+      <w:numFmt w:val="decimal"/>
+      <w:lvlText w:val="%1."/>
+      <w:lvlJc w:val="left"/>
+      <w:pPr>
+        <w:tabs>
+          <w:tab w:val="num" w:pos="720"/>
+        </w:tabs>
+        <w:ind w:left="720" w:hanging="360"/>
+      </w:pPr>
+    </w:lvl>
+    <w:lvl w:ilvl="1" w:tentative="1">
+      <w:start w:val="1"/>
+      <w:numFmt w:val="decimal"/>
+      <w:lvlText w:val="%2."/>
+      <w:lvlJc w:val="left"/>
+      <w:pPr>
+        <w:tabs>
+          <w:tab w:val="num" w:pos="1440"/>
+        </w:tabs>
+        <w:ind w:left="1440" w:hanging="360"/>
+      </w:pPr>
+    </w:lvl>
+    <w:lvl w:ilvl="2" w:tentative="1">
+      <w:start w:val="1"/>
+      <w:numFmt w:val="decimal"/>
+      <w:lvlText w:val="%3."/>
+      <w:lvlJc w:val="left"/>
+      <w:pPr>
+        <w:tabs>
+          <w:tab w:val="num" w:pos="2160"/>
+        </w:tabs>
+        <w:ind w:left="2160" w:hanging="360"/>
+      </w:pPr>
+    </w:lvl>
+    <w:lvl w:ilvl="3" w:tentative="1">
+      <w:start w:val="1"/>
+      <w:numFmt w:val="decimal"/>
+      <w:lvlText w:val="%4."/>
+      <w:lvlJc w:val="left"/>
+      <w:pPr>
+        <w:tabs>
+          <w:tab w:val="num" w:pos="2880"/>
+        </w:tabs>
+        <w:ind w:left="2880" w:hanging="360"/>
+      </w:pPr>
+    </w:lvl>
+    <w:lvl w:ilvl="4" w:tentative="1">
+      <w:start w:val="1"/>
+      <w:numFmt w:val="decimal"/>
+      <w:lvlText w:val="%5."/>
+      <w:lvlJc w:val="left"/>
+      <w:pPr>
+        <w:tabs>
+          <w:tab w:val="num" w:pos="3600"/>
+        </w:tabs>
+        <w:ind w:left="3600" w:hanging="360"/>
+      </w:pPr>
+    </w:lvl>
+    <w:lvl w:ilvl="5" w:tentative="1">
+      <w:start w:val="1"/>
+      <w:numFmt w:val="decimal"/>
+      <w:lvlText w:val="%6."/>
+      <w:lvlJc w:val="left"/>
+      <w:pPr>
+        <w:tabs>
+          <w:tab w:val="num" w:pos="4320"/>
+        </w:tabs>
+        <w:ind w:left="4320" w:hanging="360"/>
+      </w:pPr>
+    </w:lvl>
+    <w:lvl w:ilvl="6" w:tentative="1">
+      <w:start w:val="1"/>
+      <w:numFmt w:val="decimal"/>
+      <w:lvlText w:val="%7."/>
+      <w:lvlJc w:val="left"/>
+      <w:pPr>
+        <w:tabs>
+          <w:tab w:val="num" w:pos="5040"/>
+        </w:tabs>
+        <w:ind w:left="5040" w:hanging="360"/>
+      </w:pPr>
+    </w:lvl>
+    <w:lvl w:ilvl="7" w:tentative="1">
+      <w:start w:val="1"/>
+      <w:numFmt w:val="decimal"/>
+      <w:lvlText w:val="%8."/>
+      <w:lvlJc w:val="left"/>
+      <w:pPr>
+        <w:tabs>
+          <w:tab w:val="num" w:pos="5760"/>
+        </w:tabs>
+        <w:ind w:left="5760" w:hanging="360"/>
+      </w:pPr>
+    </w:lvl>
+    <w:lvl w:ilvl="8" w:tentative="1">
+      <w:start w:val="1"/>
+      <w:numFmt w:val="decimal"/>
+      <w:lvlText w:val="%9."/>
+      <w:lvlJc w:val="left"/>
+      <w:pPr>
+        <w:tabs>
+          <w:tab w:val="num" w:pos="6480"/>
+        </w:tabs>
+        <w:ind w:left="6480" w:hanging="360"/>
+      </w:pPr>
+    </w:lvl>
+  </w:abstractNum>
+  <w:abstractNum w:abstractNumId="8" w15:restartNumberingAfterBreak="0">
+    <w:nsid w:val="5D932BF7"/>
+    <w:multiLevelType w:val="multilevel"/>
+    <w:tmpl w:val="A7806AA4"/>
+    <w:lvl w:ilvl="0">
+      <w:start w:val="1"/>
+      <w:numFmt w:val="decimal"/>
+      <w:lvlText w:val="%1."/>
+      <w:lvlJc w:val="left"/>
+      <w:pPr>
+        <w:tabs>
+          <w:tab w:val="num" w:pos="720"/>
+        </w:tabs>
+        <w:ind w:left="720" w:hanging="360"/>
+      </w:pPr>
+    </w:lvl>
+    <w:lvl w:ilvl="1" w:tentative="1">
+      <w:start w:val="1"/>
+      <w:numFmt w:val="decimal"/>
+      <w:lvlText w:val="%2."/>
+      <w:lvlJc w:val="left"/>
+      <w:pPr>
+        <w:tabs>
+          <w:tab w:val="num" w:pos="1440"/>
+        </w:tabs>
+        <w:ind w:left="1440" w:hanging="360"/>
+      </w:pPr>
+    </w:lvl>
+    <w:lvl w:ilvl="2" w:tentative="1">
+      <w:start w:val="1"/>
+      <w:numFmt w:val="decimal"/>
+      <w:lvlText w:val="%3."/>
+      <w:lvlJc w:val="left"/>
+      <w:pPr>
+        <w:tabs>
+          <w:tab w:val="num" w:pos="2160"/>
+        </w:tabs>
+        <w:ind w:left="2160" w:hanging="360"/>
+      </w:pPr>
+    </w:lvl>
+    <w:lvl w:ilvl="3" w:tentative="1">
+      <w:start w:val="1"/>
+      <w:numFmt w:val="decimal"/>
+      <w:lvlText w:val="%4."/>
+      <w:lvlJc w:val="left"/>
+      <w:pPr>
+        <w:tabs>
+          <w:tab w:val="num" w:pos="2880"/>
+        </w:tabs>
+        <w:ind w:left="2880" w:hanging="360"/>
+      </w:pPr>
+    </w:lvl>
+    <w:lvl w:ilvl="4" w:tentative="1">
+      <w:start w:val="1"/>
+      <w:numFmt w:val="decimal"/>
+      <w:lvlText w:val="%5."/>
+      <w:lvlJc w:val="left"/>
+      <w:pPr>
+        <w:tabs>
+          <w:tab w:val="num" w:pos="3600"/>
+        </w:tabs>
+        <w:ind w:left="3600" w:hanging="360"/>
+      </w:pPr>
+    </w:lvl>
+    <w:lvl w:ilvl="5" w:tentative="1">
+      <w:start w:val="1"/>
+      <w:numFmt w:val="decimal"/>
+      <w:lvlText w:val="%6."/>
+      <w:lvlJc w:val="left"/>
+      <w:pPr>
+        <w:tabs>
+          <w:tab w:val="num" w:pos="4320"/>
+        </w:tabs>
+        <w:ind w:left="4320" w:hanging="360"/>
+      </w:pPr>
+    </w:lvl>
+    <w:lvl w:ilvl="6" w:tentative="1">
+      <w:start w:val="1"/>
+      <w:numFmt w:val="decimal"/>
+      <w:lvlText w:val="%7."/>
+      <w:lvlJc w:val="left"/>
+      <w:pPr>
+        <w:tabs>
+          <w:tab w:val="num" w:pos="5040"/>
+        </w:tabs>
+        <w:ind w:left="5040" w:hanging="360"/>
+      </w:pPr>
+    </w:lvl>
+    <w:lvl w:ilvl="7" w:tentative="1">
+      <w:start w:val="1"/>
+      <w:numFmt w:val="decimal"/>
+      <w:lvlText w:val="%8."/>
+      <w:lvlJc w:val="left"/>
+      <w:pPr>
+        <w:tabs>
+          <w:tab w:val="num" w:pos="5760"/>
+        </w:tabs>
+        <w:ind w:left="5760" w:hanging="360"/>
+      </w:pPr>
+    </w:lvl>
+    <w:lvl w:ilvl="8" w:tentative="1">
+      <w:start w:val="1"/>
+      <w:numFmt w:val="decimal"/>
+      <w:lvlText w:val="%9."/>
+      <w:lvlJc w:val="left"/>
+      <w:pPr>
+        <w:tabs>
+          <w:tab w:val="num" w:pos="6480"/>
+        </w:tabs>
+        <w:ind w:left="6480" w:hanging="360"/>
+      </w:pPr>
+    </w:lvl>
+  </w:abstractNum>
+  <w:abstractNum w:abstractNumId="9" w15:restartNumberingAfterBreak="0">
+    <w:nsid w:val="65A94979"/>
+    <w:multiLevelType w:val="multilevel"/>
+    <w:tmpl w:val="FAE84A4E"/>
     <w:lvl w:ilvl="0">
       <w:start w:val="1"/>
       <w:numFmt w:val="bullet"/>
@@ -16760,1011 +17706,35 @@
       </w:rPr>
     </w:lvl>
   </w:abstractNum>
-  <w:abstractNum w:abstractNumId="2" w15:restartNumberingAfterBreak="0">
-    <w:nsid w:val="18467662"/>
-    <w:multiLevelType w:val="multilevel"/>
-    <w:tmpl w:val="9A566C30"/>
-    <w:lvl w:ilvl="0">
-      <w:start w:val="1"/>
-      <w:numFmt w:val="decimal"/>
-      <w:lvlText w:val="%1."/>
-      <w:lvlJc w:val="left"/>
-      <w:pPr>
-        <w:tabs>
-          <w:tab w:val="num" w:pos="720"/>
-        </w:tabs>
-        <w:ind w:left="720" w:hanging="360"/>
-      </w:pPr>
-    </w:lvl>
-    <w:lvl w:ilvl="1" w:tentative="1">
-      <w:start w:val="1"/>
-      <w:numFmt w:val="decimal"/>
-      <w:lvlText w:val="%2."/>
-      <w:lvlJc w:val="left"/>
-      <w:pPr>
-        <w:tabs>
-          <w:tab w:val="num" w:pos="1440"/>
-        </w:tabs>
-        <w:ind w:left="1440" w:hanging="360"/>
-      </w:pPr>
-    </w:lvl>
-    <w:lvl w:ilvl="2" w:tentative="1">
-      <w:start w:val="1"/>
-      <w:numFmt w:val="decimal"/>
-      <w:lvlText w:val="%3."/>
-      <w:lvlJc w:val="left"/>
-      <w:pPr>
-        <w:tabs>
-          <w:tab w:val="num" w:pos="2160"/>
-        </w:tabs>
-        <w:ind w:left="2160" w:hanging="360"/>
-      </w:pPr>
-    </w:lvl>
-    <w:lvl w:ilvl="3" w:tentative="1">
-      <w:start w:val="1"/>
-      <w:numFmt w:val="decimal"/>
-      <w:lvlText w:val="%4."/>
-      <w:lvlJc w:val="left"/>
-      <w:pPr>
-        <w:tabs>
-          <w:tab w:val="num" w:pos="2880"/>
-        </w:tabs>
-        <w:ind w:left="2880" w:hanging="360"/>
-      </w:pPr>
-    </w:lvl>
-    <w:lvl w:ilvl="4" w:tentative="1">
-      <w:start w:val="1"/>
-      <w:numFmt w:val="decimal"/>
-      <w:lvlText w:val="%5."/>
-      <w:lvlJc w:val="left"/>
-      <w:pPr>
-        <w:tabs>
-          <w:tab w:val="num" w:pos="3600"/>
-        </w:tabs>
-        <w:ind w:left="3600" w:hanging="360"/>
-      </w:pPr>
-    </w:lvl>
-    <w:lvl w:ilvl="5" w:tentative="1">
-      <w:start w:val="1"/>
-      <w:numFmt w:val="decimal"/>
-      <w:lvlText w:val="%6."/>
-      <w:lvlJc w:val="left"/>
-      <w:pPr>
-        <w:tabs>
-          <w:tab w:val="num" w:pos="4320"/>
-        </w:tabs>
-        <w:ind w:left="4320" w:hanging="360"/>
-      </w:pPr>
-    </w:lvl>
-    <w:lvl w:ilvl="6" w:tentative="1">
-      <w:start w:val="1"/>
-      <w:numFmt w:val="decimal"/>
-      <w:lvlText w:val="%7."/>
-      <w:lvlJc w:val="left"/>
-      <w:pPr>
-        <w:tabs>
-          <w:tab w:val="num" w:pos="5040"/>
-        </w:tabs>
-        <w:ind w:left="5040" w:hanging="360"/>
-      </w:pPr>
-    </w:lvl>
-    <w:lvl w:ilvl="7" w:tentative="1">
-      <w:start w:val="1"/>
-      <w:numFmt w:val="decimal"/>
-      <w:lvlText w:val="%8."/>
-      <w:lvlJc w:val="left"/>
-      <w:pPr>
-        <w:tabs>
-          <w:tab w:val="num" w:pos="5760"/>
-        </w:tabs>
-        <w:ind w:left="5760" w:hanging="360"/>
-      </w:pPr>
-    </w:lvl>
-    <w:lvl w:ilvl="8" w:tentative="1">
-      <w:start w:val="1"/>
-      <w:numFmt w:val="decimal"/>
-      <w:lvlText w:val="%9."/>
-      <w:lvlJc w:val="left"/>
-      <w:pPr>
-        <w:tabs>
-          <w:tab w:val="num" w:pos="6480"/>
-        </w:tabs>
-        <w:ind w:left="6480" w:hanging="360"/>
-      </w:pPr>
-    </w:lvl>
-  </w:abstractNum>
-  <w:abstractNum w:abstractNumId="3" w15:restartNumberingAfterBreak="0">
-    <w:nsid w:val="31A65B18"/>
-    <w:multiLevelType w:val="multilevel"/>
-    <w:tmpl w:val="DB04D890"/>
-    <w:lvl w:ilvl="0">
-      <w:start w:val="1"/>
-      <w:numFmt w:val="bullet"/>
-      <w:lvlText w:val=""/>
-      <w:lvlJc w:val="left"/>
-      <w:pPr>
-        <w:tabs>
-          <w:tab w:val="num" w:pos="720"/>
-        </w:tabs>
-        <w:ind w:left="720" w:hanging="360"/>
-      </w:pPr>
-      <w:rPr>
-        <w:rFonts w:ascii="Symbol" w:hAnsi="Symbol" w:hint="default"/>
-        <w:sz w:val="20"/>
-      </w:rPr>
-    </w:lvl>
-    <w:lvl w:ilvl="1" w:tentative="1">
-      <w:start w:val="1"/>
-      <w:numFmt w:val="bullet"/>
-      <w:lvlText w:val="o"/>
-      <w:lvlJc w:val="left"/>
-      <w:pPr>
-        <w:tabs>
-          <w:tab w:val="num" w:pos="1440"/>
-        </w:tabs>
-        <w:ind w:left="1440" w:hanging="360"/>
-      </w:pPr>
-      <w:rPr>
-        <w:rFonts w:ascii="Courier New" w:hAnsi="Courier New" w:hint="default"/>
-        <w:sz w:val="20"/>
-      </w:rPr>
-    </w:lvl>
-    <w:lvl w:ilvl="2" w:tentative="1">
-      <w:start w:val="1"/>
-      <w:numFmt w:val="bullet"/>
-      <w:lvlText w:val=""/>
-      <w:lvlJc w:val="left"/>
-      <w:pPr>
-        <w:tabs>
-          <w:tab w:val="num" w:pos="2160"/>
-        </w:tabs>
-        <w:ind w:left="2160" w:hanging="360"/>
-      </w:pPr>
-      <w:rPr>
-        <w:rFonts w:ascii="Wingdings" w:hAnsi="Wingdings" w:hint="default"/>
-        <w:sz w:val="20"/>
-      </w:rPr>
-    </w:lvl>
-    <w:lvl w:ilvl="3" w:tentative="1">
-      <w:start w:val="1"/>
-      <w:numFmt w:val="bullet"/>
-      <w:lvlText w:val=""/>
-      <w:lvlJc w:val="left"/>
-      <w:pPr>
-        <w:tabs>
-          <w:tab w:val="num" w:pos="2880"/>
-        </w:tabs>
-        <w:ind w:left="2880" w:hanging="360"/>
-      </w:pPr>
-      <w:rPr>
-        <w:rFonts w:ascii="Wingdings" w:hAnsi="Wingdings" w:hint="default"/>
-        <w:sz w:val="20"/>
-      </w:rPr>
-    </w:lvl>
-    <w:lvl w:ilvl="4" w:tentative="1">
-      <w:start w:val="1"/>
-      <w:numFmt w:val="bullet"/>
-      <w:lvlText w:val=""/>
-      <w:lvlJc w:val="left"/>
-      <w:pPr>
-        <w:tabs>
-          <w:tab w:val="num" w:pos="3600"/>
-        </w:tabs>
-        <w:ind w:left="3600" w:hanging="360"/>
-      </w:pPr>
-      <w:rPr>
-        <w:rFonts w:ascii="Wingdings" w:hAnsi="Wingdings" w:hint="default"/>
-        <w:sz w:val="20"/>
-      </w:rPr>
-    </w:lvl>
-    <w:lvl w:ilvl="5" w:tentative="1">
-      <w:start w:val="1"/>
-      <w:numFmt w:val="bullet"/>
-      <w:lvlText w:val=""/>
-      <w:lvlJc w:val="left"/>
-      <w:pPr>
-        <w:tabs>
-          <w:tab w:val="num" w:pos="4320"/>
-        </w:tabs>
-        <w:ind w:left="4320" w:hanging="360"/>
-      </w:pPr>
-      <w:rPr>
-        <w:rFonts w:ascii="Wingdings" w:hAnsi="Wingdings" w:hint="default"/>
-        <w:sz w:val="20"/>
-      </w:rPr>
-    </w:lvl>
-    <w:lvl w:ilvl="6" w:tentative="1">
-      <w:start w:val="1"/>
-      <w:numFmt w:val="bullet"/>
-      <w:lvlText w:val=""/>
-      <w:lvlJc w:val="left"/>
-      <w:pPr>
-        <w:tabs>
-          <w:tab w:val="num" w:pos="5040"/>
-        </w:tabs>
-        <w:ind w:left="5040" w:hanging="360"/>
-      </w:pPr>
-      <w:rPr>
-        <w:rFonts w:ascii="Wingdings" w:hAnsi="Wingdings" w:hint="default"/>
-        <w:sz w:val="20"/>
-      </w:rPr>
-    </w:lvl>
-    <w:lvl w:ilvl="7" w:tentative="1">
-      <w:start w:val="1"/>
-      <w:numFmt w:val="bullet"/>
-      <w:lvlText w:val=""/>
-      <w:lvlJc w:val="left"/>
-      <w:pPr>
-        <w:tabs>
-          <w:tab w:val="num" w:pos="5760"/>
-        </w:tabs>
-        <w:ind w:left="5760" w:hanging="360"/>
-      </w:pPr>
-      <w:rPr>
-        <w:rFonts w:ascii="Wingdings" w:hAnsi="Wingdings" w:hint="default"/>
-        <w:sz w:val="20"/>
-      </w:rPr>
-    </w:lvl>
-    <w:lvl w:ilvl="8" w:tentative="1">
-      <w:start w:val="1"/>
-      <w:numFmt w:val="bullet"/>
-      <w:lvlText w:val=""/>
-      <w:lvlJc w:val="left"/>
-      <w:pPr>
-        <w:tabs>
-          <w:tab w:val="num" w:pos="6480"/>
-        </w:tabs>
-        <w:ind w:left="6480" w:hanging="360"/>
-      </w:pPr>
-      <w:rPr>
-        <w:rFonts w:ascii="Wingdings" w:hAnsi="Wingdings" w:hint="default"/>
-        <w:sz w:val="20"/>
-      </w:rPr>
-    </w:lvl>
-  </w:abstractNum>
-  <w:abstractNum w:abstractNumId="4" w15:restartNumberingAfterBreak="0">
-    <w:nsid w:val="4A35073F"/>
-    <w:multiLevelType w:val="multilevel"/>
-    <w:tmpl w:val="4B8C93A6"/>
-    <w:lvl w:ilvl="0">
-      <w:start w:val="1"/>
-      <w:numFmt w:val="decimal"/>
-      <w:lvlText w:val="%1."/>
-      <w:lvlJc w:val="left"/>
-      <w:pPr>
-        <w:tabs>
-          <w:tab w:val="num" w:pos="720"/>
-        </w:tabs>
-        <w:ind w:left="720" w:hanging="360"/>
-      </w:pPr>
-    </w:lvl>
-    <w:lvl w:ilvl="1" w:tentative="1">
-      <w:start w:val="1"/>
-      <w:numFmt w:val="decimal"/>
-      <w:lvlText w:val="%2."/>
-      <w:lvlJc w:val="left"/>
-      <w:pPr>
-        <w:tabs>
-          <w:tab w:val="num" w:pos="1440"/>
-        </w:tabs>
-        <w:ind w:left="1440" w:hanging="360"/>
-      </w:pPr>
-    </w:lvl>
-    <w:lvl w:ilvl="2" w:tentative="1">
-      <w:start w:val="1"/>
-      <w:numFmt w:val="decimal"/>
-      <w:lvlText w:val="%3."/>
-      <w:lvlJc w:val="left"/>
-      <w:pPr>
-        <w:tabs>
-          <w:tab w:val="num" w:pos="2160"/>
-        </w:tabs>
-        <w:ind w:left="2160" w:hanging="360"/>
-      </w:pPr>
-    </w:lvl>
-    <w:lvl w:ilvl="3" w:tentative="1">
-      <w:start w:val="1"/>
-      <w:numFmt w:val="decimal"/>
-      <w:lvlText w:val="%4."/>
-      <w:lvlJc w:val="left"/>
-      <w:pPr>
-        <w:tabs>
-          <w:tab w:val="num" w:pos="2880"/>
-        </w:tabs>
-        <w:ind w:left="2880" w:hanging="360"/>
-      </w:pPr>
-    </w:lvl>
-    <w:lvl w:ilvl="4" w:tentative="1">
-      <w:start w:val="1"/>
-      <w:numFmt w:val="decimal"/>
-      <w:lvlText w:val="%5."/>
-      <w:lvlJc w:val="left"/>
-      <w:pPr>
-        <w:tabs>
-          <w:tab w:val="num" w:pos="3600"/>
-        </w:tabs>
-        <w:ind w:left="3600" w:hanging="360"/>
-      </w:pPr>
-    </w:lvl>
-    <w:lvl w:ilvl="5" w:tentative="1">
-      <w:start w:val="1"/>
-      <w:numFmt w:val="decimal"/>
-      <w:lvlText w:val="%6."/>
-      <w:lvlJc w:val="left"/>
-      <w:pPr>
-        <w:tabs>
-          <w:tab w:val="num" w:pos="4320"/>
-        </w:tabs>
-        <w:ind w:left="4320" w:hanging="360"/>
-      </w:pPr>
-    </w:lvl>
-    <w:lvl w:ilvl="6" w:tentative="1">
-      <w:start w:val="1"/>
-      <w:numFmt w:val="decimal"/>
-      <w:lvlText w:val="%7."/>
-      <w:lvlJc w:val="left"/>
-      <w:pPr>
-        <w:tabs>
-          <w:tab w:val="num" w:pos="5040"/>
-        </w:tabs>
-        <w:ind w:left="5040" w:hanging="360"/>
-      </w:pPr>
-    </w:lvl>
-    <w:lvl w:ilvl="7" w:tentative="1">
-      <w:start w:val="1"/>
-      <w:numFmt w:val="decimal"/>
-      <w:lvlText w:val="%8."/>
-      <w:lvlJc w:val="left"/>
-      <w:pPr>
-        <w:tabs>
-          <w:tab w:val="num" w:pos="5760"/>
-        </w:tabs>
-        <w:ind w:left="5760" w:hanging="360"/>
-      </w:pPr>
-    </w:lvl>
-    <w:lvl w:ilvl="8" w:tentative="1">
-      <w:start w:val="1"/>
-      <w:numFmt w:val="decimal"/>
-      <w:lvlText w:val="%9."/>
-      <w:lvlJc w:val="left"/>
-      <w:pPr>
-        <w:tabs>
-          <w:tab w:val="num" w:pos="6480"/>
-        </w:tabs>
-        <w:ind w:left="6480" w:hanging="360"/>
-      </w:pPr>
-    </w:lvl>
-  </w:abstractNum>
-  <w:abstractNum w:abstractNumId="5" w15:restartNumberingAfterBreak="0">
-    <w:nsid w:val="536458B8"/>
-    <w:multiLevelType w:val="multilevel"/>
-    <w:tmpl w:val="8D6A8B28"/>
-    <w:lvl w:ilvl="0">
-      <w:start w:val="1"/>
-      <w:numFmt w:val="decimal"/>
-      <w:lvlText w:val="%1."/>
-      <w:lvlJc w:val="left"/>
-      <w:pPr>
-        <w:tabs>
-          <w:tab w:val="num" w:pos="720"/>
-        </w:tabs>
-        <w:ind w:left="720" w:hanging="360"/>
-      </w:pPr>
-    </w:lvl>
-    <w:lvl w:ilvl="1" w:tentative="1">
-      <w:start w:val="1"/>
-      <w:numFmt w:val="decimal"/>
-      <w:lvlText w:val="%2."/>
-      <w:lvlJc w:val="left"/>
-      <w:pPr>
-        <w:tabs>
-          <w:tab w:val="num" w:pos="1440"/>
-        </w:tabs>
-        <w:ind w:left="1440" w:hanging="360"/>
-      </w:pPr>
-    </w:lvl>
-    <w:lvl w:ilvl="2" w:tentative="1">
-      <w:start w:val="1"/>
-      <w:numFmt w:val="decimal"/>
-      <w:lvlText w:val="%3."/>
-      <w:lvlJc w:val="left"/>
-      <w:pPr>
-        <w:tabs>
-          <w:tab w:val="num" w:pos="2160"/>
-        </w:tabs>
-        <w:ind w:left="2160" w:hanging="360"/>
-      </w:pPr>
-    </w:lvl>
-    <w:lvl w:ilvl="3" w:tentative="1">
-      <w:start w:val="1"/>
-      <w:numFmt w:val="decimal"/>
-      <w:lvlText w:val="%4."/>
-      <w:lvlJc w:val="left"/>
-      <w:pPr>
-        <w:tabs>
-          <w:tab w:val="num" w:pos="2880"/>
-        </w:tabs>
-        <w:ind w:left="2880" w:hanging="360"/>
-      </w:pPr>
-    </w:lvl>
-    <w:lvl w:ilvl="4" w:tentative="1">
-      <w:start w:val="1"/>
-      <w:numFmt w:val="decimal"/>
-      <w:lvlText w:val="%5."/>
-      <w:lvlJc w:val="left"/>
-      <w:pPr>
-        <w:tabs>
-          <w:tab w:val="num" w:pos="3600"/>
-        </w:tabs>
-        <w:ind w:left="3600" w:hanging="360"/>
-      </w:pPr>
-    </w:lvl>
-    <w:lvl w:ilvl="5" w:tentative="1">
-      <w:start w:val="1"/>
-      <w:numFmt w:val="decimal"/>
-      <w:lvlText w:val="%6."/>
-      <w:lvlJc w:val="left"/>
-      <w:pPr>
-        <w:tabs>
-          <w:tab w:val="num" w:pos="4320"/>
-        </w:tabs>
-        <w:ind w:left="4320" w:hanging="360"/>
-      </w:pPr>
-    </w:lvl>
-    <w:lvl w:ilvl="6" w:tentative="1">
-      <w:start w:val="1"/>
-      <w:numFmt w:val="decimal"/>
-      <w:lvlText w:val="%7."/>
-      <w:lvlJc w:val="left"/>
-      <w:pPr>
-        <w:tabs>
-          <w:tab w:val="num" w:pos="5040"/>
-        </w:tabs>
-        <w:ind w:left="5040" w:hanging="360"/>
-      </w:pPr>
-    </w:lvl>
-    <w:lvl w:ilvl="7" w:tentative="1">
-      <w:start w:val="1"/>
-      <w:numFmt w:val="decimal"/>
-      <w:lvlText w:val="%8."/>
-      <w:lvlJc w:val="left"/>
-      <w:pPr>
-        <w:tabs>
-          <w:tab w:val="num" w:pos="5760"/>
-        </w:tabs>
-        <w:ind w:left="5760" w:hanging="360"/>
-      </w:pPr>
-    </w:lvl>
-    <w:lvl w:ilvl="8" w:tentative="1">
-      <w:start w:val="1"/>
-      <w:numFmt w:val="decimal"/>
-      <w:lvlText w:val="%9."/>
-      <w:lvlJc w:val="left"/>
-      <w:pPr>
-        <w:tabs>
-          <w:tab w:val="num" w:pos="6480"/>
-        </w:tabs>
-        <w:ind w:left="6480" w:hanging="360"/>
-      </w:pPr>
-    </w:lvl>
-  </w:abstractNum>
-  <w:abstractNum w:abstractNumId="6" w15:restartNumberingAfterBreak="0">
-    <w:nsid w:val="583D628B"/>
-    <w:multiLevelType w:val="multilevel"/>
-    <w:tmpl w:val="8006FB7C"/>
-    <w:lvl w:ilvl="0">
-      <w:start w:val="1"/>
-      <w:numFmt w:val="decimal"/>
-      <w:lvlText w:val="%1."/>
-      <w:lvlJc w:val="left"/>
-      <w:pPr>
-        <w:tabs>
-          <w:tab w:val="num" w:pos="720"/>
-        </w:tabs>
-        <w:ind w:left="720" w:hanging="360"/>
-      </w:pPr>
-    </w:lvl>
-    <w:lvl w:ilvl="1" w:tentative="1">
-      <w:start w:val="1"/>
-      <w:numFmt w:val="decimal"/>
-      <w:lvlText w:val="%2."/>
-      <w:lvlJc w:val="left"/>
-      <w:pPr>
-        <w:tabs>
-          <w:tab w:val="num" w:pos="1440"/>
-        </w:tabs>
-        <w:ind w:left="1440" w:hanging="360"/>
-      </w:pPr>
-    </w:lvl>
-    <w:lvl w:ilvl="2" w:tentative="1">
-      <w:start w:val="1"/>
-      <w:numFmt w:val="decimal"/>
-      <w:lvlText w:val="%3."/>
-      <w:lvlJc w:val="left"/>
-      <w:pPr>
-        <w:tabs>
-          <w:tab w:val="num" w:pos="2160"/>
-        </w:tabs>
-        <w:ind w:left="2160" w:hanging="360"/>
-      </w:pPr>
-    </w:lvl>
-    <w:lvl w:ilvl="3" w:tentative="1">
-      <w:start w:val="1"/>
-      <w:numFmt w:val="decimal"/>
-      <w:lvlText w:val="%4."/>
-      <w:lvlJc w:val="left"/>
-      <w:pPr>
-        <w:tabs>
-          <w:tab w:val="num" w:pos="2880"/>
-        </w:tabs>
-        <w:ind w:left="2880" w:hanging="360"/>
-      </w:pPr>
-    </w:lvl>
-    <w:lvl w:ilvl="4" w:tentative="1">
-      <w:start w:val="1"/>
-      <w:numFmt w:val="decimal"/>
-      <w:lvlText w:val="%5."/>
-      <w:lvlJc w:val="left"/>
-      <w:pPr>
-        <w:tabs>
-          <w:tab w:val="num" w:pos="3600"/>
-        </w:tabs>
-        <w:ind w:left="3600" w:hanging="360"/>
-      </w:pPr>
-    </w:lvl>
-    <w:lvl w:ilvl="5" w:tentative="1">
-      <w:start w:val="1"/>
-      <w:numFmt w:val="decimal"/>
-      <w:lvlText w:val="%6."/>
-      <w:lvlJc w:val="left"/>
-      <w:pPr>
-        <w:tabs>
-          <w:tab w:val="num" w:pos="4320"/>
-        </w:tabs>
-        <w:ind w:left="4320" w:hanging="360"/>
-      </w:pPr>
-    </w:lvl>
-    <w:lvl w:ilvl="6" w:tentative="1">
-      <w:start w:val="1"/>
-      <w:numFmt w:val="decimal"/>
-      <w:lvlText w:val="%7."/>
-      <w:lvlJc w:val="left"/>
-      <w:pPr>
-        <w:tabs>
-          <w:tab w:val="num" w:pos="5040"/>
-        </w:tabs>
-        <w:ind w:left="5040" w:hanging="360"/>
-      </w:pPr>
-    </w:lvl>
-    <w:lvl w:ilvl="7" w:tentative="1">
-      <w:start w:val="1"/>
-      <w:numFmt w:val="decimal"/>
-      <w:lvlText w:val="%8."/>
-      <w:lvlJc w:val="left"/>
-      <w:pPr>
-        <w:tabs>
-          <w:tab w:val="num" w:pos="5760"/>
-        </w:tabs>
-        <w:ind w:left="5760" w:hanging="360"/>
-      </w:pPr>
-    </w:lvl>
-    <w:lvl w:ilvl="8" w:tentative="1">
-      <w:start w:val="1"/>
-      <w:numFmt w:val="decimal"/>
-      <w:lvlText w:val="%9."/>
-      <w:lvlJc w:val="left"/>
-      <w:pPr>
-        <w:tabs>
-          <w:tab w:val="num" w:pos="6480"/>
-        </w:tabs>
-        <w:ind w:left="6480" w:hanging="360"/>
-      </w:pPr>
-    </w:lvl>
-  </w:abstractNum>
-  <w:abstractNum w:abstractNumId="7" w15:restartNumberingAfterBreak="0">
-    <w:nsid w:val="731A7248"/>
-    <w:multiLevelType w:val="multilevel"/>
-    <w:tmpl w:val="F37EDB58"/>
-    <w:lvl w:ilvl="0">
-      <w:start w:val="4"/>
-      <w:numFmt w:val="decimal"/>
-      <w:lvlText w:val="%1."/>
-      <w:lvlJc w:val="left"/>
-      <w:pPr>
-        <w:tabs>
-          <w:tab w:val="num" w:pos="720"/>
-        </w:tabs>
-        <w:ind w:left="720" w:hanging="360"/>
-      </w:pPr>
-    </w:lvl>
-    <w:lvl w:ilvl="1" w:tentative="1">
-      <w:start w:val="1"/>
-      <w:numFmt w:val="decimal"/>
-      <w:lvlText w:val="%2."/>
-      <w:lvlJc w:val="left"/>
-      <w:pPr>
-        <w:tabs>
-          <w:tab w:val="num" w:pos="1440"/>
-        </w:tabs>
-        <w:ind w:left="1440" w:hanging="360"/>
-      </w:pPr>
-    </w:lvl>
-    <w:lvl w:ilvl="2" w:tentative="1">
-      <w:start w:val="1"/>
-      <w:numFmt w:val="decimal"/>
-      <w:lvlText w:val="%3."/>
-      <w:lvlJc w:val="left"/>
-      <w:pPr>
-        <w:tabs>
-          <w:tab w:val="num" w:pos="2160"/>
-        </w:tabs>
-        <w:ind w:left="2160" w:hanging="360"/>
-      </w:pPr>
-    </w:lvl>
-    <w:lvl w:ilvl="3" w:tentative="1">
-      <w:start w:val="1"/>
-      <w:numFmt w:val="decimal"/>
-      <w:lvlText w:val="%4."/>
-      <w:lvlJc w:val="left"/>
-      <w:pPr>
-        <w:tabs>
-          <w:tab w:val="num" w:pos="2880"/>
-        </w:tabs>
-        <w:ind w:left="2880" w:hanging="360"/>
-      </w:pPr>
-    </w:lvl>
-    <w:lvl w:ilvl="4" w:tentative="1">
-      <w:start w:val="1"/>
-      <w:numFmt w:val="decimal"/>
-      <w:lvlText w:val="%5."/>
-      <w:lvlJc w:val="left"/>
-      <w:pPr>
-        <w:tabs>
-          <w:tab w:val="num" w:pos="3600"/>
-        </w:tabs>
-        <w:ind w:left="3600" w:hanging="360"/>
-      </w:pPr>
-    </w:lvl>
-    <w:lvl w:ilvl="5" w:tentative="1">
-      <w:start w:val="1"/>
-      <w:numFmt w:val="decimal"/>
-      <w:lvlText w:val="%6."/>
-      <w:lvlJc w:val="left"/>
-      <w:pPr>
-        <w:tabs>
-          <w:tab w:val="num" w:pos="4320"/>
-        </w:tabs>
-        <w:ind w:left="4320" w:hanging="360"/>
-      </w:pPr>
-    </w:lvl>
-    <w:lvl w:ilvl="6" w:tentative="1">
-      <w:start w:val="1"/>
-      <w:numFmt w:val="decimal"/>
-      <w:lvlText w:val="%7."/>
-      <w:lvlJc w:val="left"/>
-      <w:pPr>
-        <w:tabs>
-          <w:tab w:val="num" w:pos="5040"/>
-        </w:tabs>
-        <w:ind w:left="5040" w:hanging="360"/>
-      </w:pPr>
-    </w:lvl>
-    <w:lvl w:ilvl="7" w:tentative="1">
-      <w:start w:val="1"/>
-      <w:numFmt w:val="decimal"/>
-      <w:lvlText w:val="%8."/>
-      <w:lvlJc w:val="left"/>
-      <w:pPr>
-        <w:tabs>
-          <w:tab w:val="num" w:pos="5760"/>
-        </w:tabs>
-        <w:ind w:left="5760" w:hanging="360"/>
-      </w:pPr>
-    </w:lvl>
-    <w:lvl w:ilvl="8" w:tentative="1">
-      <w:start w:val="1"/>
-      <w:numFmt w:val="decimal"/>
-      <w:lvlText w:val="%9."/>
-      <w:lvlJc w:val="left"/>
-      <w:pPr>
-        <w:tabs>
-          <w:tab w:val="num" w:pos="6480"/>
-        </w:tabs>
-        <w:ind w:left="6480" w:hanging="360"/>
-      </w:pPr>
-    </w:lvl>
-  </w:abstractNum>
-  <w:abstractNum w:abstractNumId="8" w15:restartNumberingAfterBreak="0">
-    <w:nsid w:val="733E6874"/>
-    <w:multiLevelType w:val="multilevel"/>
-    <w:tmpl w:val="D37260C6"/>
-    <w:lvl w:ilvl="0">
-      <w:start w:val="1"/>
-      <w:numFmt w:val="bullet"/>
-      <w:lvlText w:val=""/>
-      <w:lvlJc w:val="left"/>
-      <w:pPr>
-        <w:tabs>
-          <w:tab w:val="num" w:pos="720"/>
-        </w:tabs>
-        <w:ind w:left="720" w:hanging="360"/>
-      </w:pPr>
-      <w:rPr>
-        <w:rFonts w:ascii="Symbol" w:hAnsi="Symbol" w:hint="default"/>
-        <w:sz w:val="20"/>
-      </w:rPr>
-    </w:lvl>
-    <w:lvl w:ilvl="1" w:tentative="1">
-      <w:start w:val="1"/>
-      <w:numFmt w:val="bullet"/>
-      <w:lvlText w:val="o"/>
-      <w:lvlJc w:val="left"/>
-      <w:pPr>
-        <w:tabs>
-          <w:tab w:val="num" w:pos="1440"/>
-        </w:tabs>
-        <w:ind w:left="1440" w:hanging="360"/>
-      </w:pPr>
-      <w:rPr>
-        <w:rFonts w:ascii="Courier New" w:hAnsi="Courier New" w:hint="default"/>
-        <w:sz w:val="20"/>
-      </w:rPr>
-    </w:lvl>
-    <w:lvl w:ilvl="2" w:tentative="1">
-      <w:start w:val="1"/>
-      <w:numFmt w:val="bullet"/>
-      <w:lvlText w:val=""/>
-      <w:lvlJc w:val="left"/>
-      <w:pPr>
-        <w:tabs>
-          <w:tab w:val="num" w:pos="2160"/>
-        </w:tabs>
-        <w:ind w:left="2160" w:hanging="360"/>
-      </w:pPr>
-      <w:rPr>
-        <w:rFonts w:ascii="Wingdings" w:hAnsi="Wingdings" w:hint="default"/>
-        <w:sz w:val="20"/>
-      </w:rPr>
-    </w:lvl>
-    <w:lvl w:ilvl="3" w:tentative="1">
-      <w:start w:val="1"/>
-      <w:numFmt w:val="bullet"/>
-      <w:lvlText w:val=""/>
-      <w:lvlJc w:val="left"/>
-      <w:pPr>
-        <w:tabs>
-          <w:tab w:val="num" w:pos="2880"/>
-        </w:tabs>
-        <w:ind w:left="2880" w:hanging="360"/>
-      </w:pPr>
-      <w:rPr>
-        <w:rFonts w:ascii="Wingdings" w:hAnsi="Wingdings" w:hint="default"/>
-        <w:sz w:val="20"/>
-      </w:rPr>
-    </w:lvl>
-    <w:lvl w:ilvl="4" w:tentative="1">
-      <w:start w:val="1"/>
-      <w:numFmt w:val="bullet"/>
-      <w:lvlText w:val=""/>
-      <w:lvlJc w:val="left"/>
-      <w:pPr>
-        <w:tabs>
-          <w:tab w:val="num" w:pos="3600"/>
-        </w:tabs>
-        <w:ind w:left="3600" w:hanging="360"/>
-      </w:pPr>
-      <w:rPr>
-        <w:rFonts w:ascii="Wingdings" w:hAnsi="Wingdings" w:hint="default"/>
-        <w:sz w:val="20"/>
-      </w:rPr>
-    </w:lvl>
-    <w:lvl w:ilvl="5" w:tentative="1">
-      <w:start w:val="1"/>
-      <w:numFmt w:val="bullet"/>
-      <w:lvlText w:val=""/>
-      <w:lvlJc w:val="left"/>
-      <w:pPr>
-        <w:tabs>
-          <w:tab w:val="num" w:pos="4320"/>
-        </w:tabs>
-        <w:ind w:left="4320" w:hanging="360"/>
-      </w:pPr>
-      <w:rPr>
-        <w:rFonts w:ascii="Wingdings" w:hAnsi="Wingdings" w:hint="default"/>
-        <w:sz w:val="20"/>
-      </w:rPr>
-    </w:lvl>
-    <w:lvl w:ilvl="6" w:tentative="1">
-      <w:start w:val="1"/>
-      <w:numFmt w:val="bullet"/>
-      <w:lvlText w:val=""/>
-      <w:lvlJc w:val="left"/>
-      <w:pPr>
-        <w:tabs>
-          <w:tab w:val="num" w:pos="5040"/>
-        </w:tabs>
-        <w:ind w:left="5040" w:hanging="360"/>
-      </w:pPr>
-      <w:rPr>
-        <w:rFonts w:ascii="Wingdings" w:hAnsi="Wingdings" w:hint="default"/>
-        <w:sz w:val="20"/>
-      </w:rPr>
-    </w:lvl>
-    <w:lvl w:ilvl="7" w:tentative="1">
-      <w:start w:val="1"/>
-      <w:numFmt w:val="bullet"/>
-      <w:lvlText w:val=""/>
-      <w:lvlJc w:val="left"/>
-      <w:pPr>
-        <w:tabs>
-          <w:tab w:val="num" w:pos="5760"/>
-        </w:tabs>
-        <w:ind w:left="5760" w:hanging="360"/>
-      </w:pPr>
-      <w:rPr>
-        <w:rFonts w:ascii="Wingdings" w:hAnsi="Wingdings" w:hint="default"/>
-        <w:sz w:val="20"/>
-      </w:rPr>
-    </w:lvl>
-    <w:lvl w:ilvl="8" w:tentative="1">
-      <w:start w:val="1"/>
-      <w:numFmt w:val="bullet"/>
-      <w:lvlText w:val=""/>
-      <w:lvlJc w:val="left"/>
-      <w:pPr>
-        <w:tabs>
-          <w:tab w:val="num" w:pos="6480"/>
-        </w:tabs>
-        <w:ind w:left="6480" w:hanging="360"/>
-      </w:pPr>
-      <w:rPr>
-        <w:rFonts w:ascii="Wingdings" w:hAnsi="Wingdings" w:hint="default"/>
-        <w:sz w:val="20"/>
-      </w:rPr>
-    </w:lvl>
-  </w:abstractNum>
-  <w:abstractNum w:abstractNumId="9" w15:restartNumberingAfterBreak="0">
-    <w:nsid w:val="7D5A35D2"/>
-    <w:multiLevelType w:val="multilevel"/>
-    <w:tmpl w:val="E07EDBEE"/>
-    <w:lvl w:ilvl="0">
-      <w:start w:val="1"/>
-      <w:numFmt w:val="decimal"/>
-      <w:lvlText w:val="%1."/>
-      <w:lvlJc w:val="left"/>
-      <w:pPr>
-        <w:tabs>
-          <w:tab w:val="num" w:pos="720"/>
-        </w:tabs>
-        <w:ind w:left="720" w:hanging="360"/>
-      </w:pPr>
-    </w:lvl>
-    <w:lvl w:ilvl="1" w:tentative="1">
-      <w:start w:val="1"/>
-      <w:numFmt w:val="decimal"/>
-      <w:lvlText w:val="%2."/>
-      <w:lvlJc w:val="left"/>
-      <w:pPr>
-        <w:tabs>
-          <w:tab w:val="num" w:pos="1440"/>
-        </w:tabs>
-        <w:ind w:left="1440" w:hanging="360"/>
-      </w:pPr>
-    </w:lvl>
-    <w:lvl w:ilvl="2" w:tentative="1">
-      <w:start w:val="1"/>
-      <w:numFmt w:val="decimal"/>
-      <w:lvlText w:val="%3."/>
-      <w:lvlJc w:val="left"/>
-      <w:pPr>
-        <w:tabs>
-          <w:tab w:val="num" w:pos="2160"/>
-        </w:tabs>
-        <w:ind w:left="2160" w:hanging="360"/>
-      </w:pPr>
-    </w:lvl>
-    <w:lvl w:ilvl="3" w:tentative="1">
-      <w:start w:val="1"/>
-      <w:numFmt w:val="decimal"/>
-      <w:lvlText w:val="%4."/>
-      <w:lvlJc w:val="left"/>
-      <w:pPr>
-        <w:tabs>
-          <w:tab w:val="num" w:pos="2880"/>
-        </w:tabs>
-        <w:ind w:left="2880" w:hanging="360"/>
-      </w:pPr>
-    </w:lvl>
-    <w:lvl w:ilvl="4" w:tentative="1">
-      <w:start w:val="1"/>
-      <w:numFmt w:val="decimal"/>
-      <w:lvlText w:val="%5."/>
-      <w:lvlJc w:val="left"/>
-      <w:pPr>
-        <w:tabs>
-          <w:tab w:val="num" w:pos="3600"/>
-        </w:tabs>
-        <w:ind w:left="3600" w:hanging="360"/>
-      </w:pPr>
-    </w:lvl>
-    <w:lvl w:ilvl="5" w:tentative="1">
-      <w:start w:val="1"/>
-      <w:numFmt w:val="decimal"/>
-      <w:lvlText w:val="%6."/>
-      <w:lvlJc w:val="left"/>
-      <w:pPr>
-        <w:tabs>
-          <w:tab w:val="num" w:pos="4320"/>
-        </w:tabs>
-        <w:ind w:left="4320" w:hanging="360"/>
-      </w:pPr>
-    </w:lvl>
-    <w:lvl w:ilvl="6" w:tentative="1">
-      <w:start w:val="1"/>
-      <w:numFmt w:val="decimal"/>
-      <w:lvlText w:val="%7."/>
-      <w:lvlJc w:val="left"/>
-      <w:pPr>
-        <w:tabs>
-          <w:tab w:val="num" w:pos="5040"/>
-        </w:tabs>
-        <w:ind w:left="5040" w:hanging="360"/>
-      </w:pPr>
-    </w:lvl>
-    <w:lvl w:ilvl="7" w:tentative="1">
-      <w:start w:val="1"/>
-      <w:numFmt w:val="decimal"/>
-      <w:lvlText w:val="%8."/>
-      <w:lvlJc w:val="left"/>
-      <w:pPr>
-        <w:tabs>
-          <w:tab w:val="num" w:pos="5760"/>
-        </w:tabs>
-        <w:ind w:left="5760" w:hanging="360"/>
-      </w:pPr>
-    </w:lvl>
-    <w:lvl w:ilvl="8" w:tentative="1">
-      <w:start w:val="1"/>
-      <w:numFmt w:val="decimal"/>
-      <w:lvlText w:val="%9."/>
-      <w:lvlJc w:val="left"/>
-      <w:pPr>
-        <w:tabs>
-          <w:tab w:val="num" w:pos="6480"/>
-        </w:tabs>
-        <w:ind w:left="6480" w:hanging="360"/>
-      </w:pPr>
-    </w:lvl>
-  </w:abstractNum>
-  <w:num w:numId="1" w16cid:durableId="679431836">
+  <w:num w:numId="1" w16cid:durableId="2054764059">
+    <w:abstractNumId w:val="9"/>
+  </w:num>
+  <w:num w:numId="2" w16cid:durableId="1321614965">
+    <w:abstractNumId w:val="8"/>
+  </w:num>
+  <w:num w:numId="3" w16cid:durableId="1039861792">
+    <w:abstractNumId w:val="3"/>
+  </w:num>
+  <w:num w:numId="4" w16cid:durableId="1152216479">
+    <w:abstractNumId w:val="7"/>
+  </w:num>
+  <w:num w:numId="5" w16cid:durableId="506410438">
+    <w:abstractNumId w:val="4"/>
+  </w:num>
+  <w:num w:numId="6" w16cid:durableId="2145344464">
+    <w:abstractNumId w:val="2"/>
+  </w:num>
+  <w:num w:numId="7" w16cid:durableId="1639604410">
+    <w:abstractNumId w:val="0"/>
+  </w:num>
+  <w:num w:numId="8" w16cid:durableId="571356368">
     <w:abstractNumId w:val="1"/>
   </w:num>
-  <w:num w:numId="2" w16cid:durableId="1762945505">
-    <w:abstractNumId w:val="4"/>
-  </w:num>
-  <w:num w:numId="3" w16cid:durableId="1122387280">
-    <w:abstractNumId w:val="3"/>
-  </w:num>
-  <w:num w:numId="4" w16cid:durableId="1881747516">
+  <w:num w:numId="9" w16cid:durableId="206571328">
     <w:abstractNumId w:val="5"/>
   </w:num>
-  <w:num w:numId="5" w16cid:durableId="1745298994">
-    <w:abstractNumId w:val="2"/>
-  </w:num>
-  <w:num w:numId="6" w16cid:durableId="535167167">
-    <w:abstractNumId w:val="7"/>
-  </w:num>
-  <w:num w:numId="7" w16cid:durableId="1185480913">
+  <w:num w:numId="10" w16cid:durableId="934629379">
     <w:abstractNumId w:val="6"/>
-  </w:num>
-  <w:num w:numId="8" w16cid:durableId="1644627276">
-    <w:abstractNumId w:val="9"/>
-  </w:num>
-  <w:num w:numId="9" w16cid:durableId="364599985">
-    <w:abstractNumId w:val="8"/>
-  </w:num>
-  <w:num w:numId="10" w16cid:durableId="1098601751">
-    <w:abstractNumId w:val="0"/>
   </w:num>
 </w:numbering>
 </file>

</xml_diff>